<commit_message>
Translate Minutes No.11 - End-of-Year Academic Review (27 June 2026) to Uzbek
Translated all 108 paragraphs of the Faculty Council end-of-year review
minutes covering educational process outcomes, academic performance analysis,
attendance monitoring, stakeholder feedback, elective courses, faculty
development, and quality assurance measures for 2026/2027.

Co-Authored-By: Claude Opus 4.6 <noreply@anthropic.com>
Claude-Session: https://claude.ai/code/session_01N9ZP28hxEfPoWHf2qaE8QM
</commit_message>
<xml_diff>
--- a/Computer Engineering, Software Engineering, Computer systems & their softwares/Annexes/Annex №19 Faculty Council Meeting Protocol/5. Minutes No.11 - End-of-Year Academic Review (27 June 2026) (EN).docx
+++ b/Computer Engineering, Software Engineering, Computer systems & their softwares/Annexes/Annex №19 Faculty Council Meeting Protocol/5. Minutes No.11 - End-of-Year Academic Review (27 June 2026) (EN).docx
@@ -1,40 +1,5 @@
 
-<file path=docProps\app.xml><?xml version="1.0" encoding="utf-8"?>
-<Properties xmlns="http://schemas.openxmlformats.org/officeDocument/2006/extended-properties" xmlns:vt="http://schemas.openxmlformats.org/officeDocument/2006/docPropsVTypes">
-  <Template>Normal</Template>
-  <TotalTime>0</TotalTime>
-  <Pages>8</Pages>
-  <Words>1894</Words>
-  <Characters>10797</Characters>
-  <Application>Microsoft Office Word</Application>
-  <DocSecurity>0</DocSecurity>
-  <Lines>89</Lines>
-  <Paragraphs>25</Paragraphs>
-  <ScaleCrop>false</ScaleCrop>
-  <Company/>
-  <LinksUpToDate>false</LinksUpToDate>
-  <CharactersWithSpaces>12666</CharactersWithSpaces>
-  <SharedDoc>false</SharedDoc>
-  <HyperlinksChanged>false</HyperlinksChanged>
-  <AppVersion>16.0000</AppVersion>
-</Properties>
-</file>
-
-<file path=docProps\core.xml><?xml version="1.0" encoding="utf-8"?>
-<cp:coreProperties xmlns:cp="http://schemas.openxmlformats.org/package/2006/metadata/core-properties" xmlns:dc="http://purl.org/dc/elements/1.1/" xmlns:dcterms="http://purl.org/dc/terms/" xmlns:dcmitype="http://purl.org/dc/dcmitype/" xmlns:xsi="http://www.w3.org/2001/XMLSchema-instance">
-  <dc:title/>
-  <dc:subject/>
-  <dc:creator>Пользователь</dc:creator>
-  <cp:keywords/>
-  <dc:description/>
-  <cp:lastModifiedBy>Пользователь</cp:lastModifiedBy>
-  <cp:revision>2</cp:revision>
-  <dcterms:created xsi:type="dcterms:W3CDTF">2026-09-20T12:07:00Z</dcterms:created>
-  <dcterms:modified xsi:type="dcterms:W3CDTF">2026-09-20T12:07:00Z</dcterms:modified>
-</cp:coreProperties>
-</file>
-
-<file path=word\document.xml><?xml version="1.0" encoding="utf-8"?>
+<file path=word/document.xml><?xml version="1.0" encoding="utf-8"?>
 <w:document xmlns:wpc="http://schemas.microsoft.com/office/word/2010/wordprocessingCanvas" xmlns:cx="http://schemas.microsoft.com/office/drawing/2014/chartex" xmlns:cx1="http://schemas.microsoft.com/office/drawing/2015/9/8/chartex" xmlns:cx2="http://schemas.microsoft.com/office/drawing/2015/10/21/chartex" xmlns:cx3="http://schemas.microsoft.com/office/drawing/2016/5/9/chartex" xmlns:cx4="http://schemas.microsoft.com/office/drawing/2016/5/10/chartex" xmlns:cx5="http://schemas.microsoft.com/office/drawing/2016/5/11/chartex" xmlns:cx6="http://schemas.microsoft.com/office/drawing/2016/5/12/chartex" xmlns:cx7="http://schemas.microsoft.com/office/drawing/2016/5/13/chartex" xmlns:cx8="http://schemas.microsoft.com/office/drawing/2016/5/14/chartex" xmlns:mc="http://schemas.openxmlformats.org/markup-compatibility/2006" xmlns:aink="http://schemas.microsoft.com/office/drawing/2016/ink" xmlns:am3d="http://schemas.microsoft.com/office/drawing/2017/model3d" xmlns:o="urn:schemas-microsoft-com:office:office" xmlns:r="http://schemas.openxmlformats.org/officeDocument/2006/relationships" xmlns:m="http://schemas.openxmlformats.org/officeDocument/2006/math" xmlns:v="urn:schemas-microsoft-com:vml" xmlns:wp14="http://schemas.microsoft.com/office/word/2010/wordprocessingDrawing" xmlns:wp="http://schemas.openxmlformats.org/drawingml/2006/wordprocessingDrawing" xmlns:w10="urn:schemas-microsoft-com:office:word" xmlns:w="http://schemas.openxmlformats.org/wordprocessingml/2006/main" xmlns:w14="http://schemas.microsoft.com/office/word/2010/wordml" xmlns:w15="http://schemas.microsoft.com/office/word/2012/wordml" xmlns:w16cex="http://schemas.microsoft.com/office/word/2018/wordml/cex" xmlns:w16cid="http://schemas.microsoft.com/office/word/2016/wordml/cid" xmlns:w16="http://schemas.microsoft.com/office/word/2018/wordml" xmlns:w16se="http://schemas.microsoft.com/office/word/2015/wordml/symex" xmlns:wpg="http://schemas.microsoft.com/office/word/2010/wordprocessingGroup" xmlns:wpi="http://schemas.microsoft.com/office/word/2010/wordprocessingInk" xmlns:wne="http://schemas.microsoft.com/office/word/2006/wordml" xmlns:wps="http://schemas.microsoft.com/office/word/2010/wordprocessingShape" mc:Ignorable="w14 w15 w16se w16cid w16 w16cex wp14">
   <w:body>
     <w:p>
@@ -61,9 +26,9 @@
           <w:szCs w:val="28"/>
           <w:lang w:val="en-US" w:eastAsia="ru-RU"/>
         </w:rPr>
-        <w:t>TERMEZ STATE UNIVERSITY</w:t>
+        <w:t>TERMIZ DAVLAT UNIVERSITETI</w:t>
         <w:br/>
-        <w:t>FACULTY OF INFORMATION TECHNOLOGIES</w:t>
+        <w:t>AXBOROT TEXNOLOGIYALARI FAKULTETI</w:t>
       </w:r>
     </w:p>
     <w:p>
@@ -92,7 +57,7 @@
           <w:szCs w:val="28"/>
           <w:lang w:val="en-US" w:eastAsia="ru-RU"/>
         </w:rPr>
-        <w:t xml:space="preserve">MINUTES OF THE MEETING OF THE FACULTY COUNCIL</w:t>
+        <w:t>FAKULTET KENGASHI YIG'ILISHI BAYONNOMASI</w:t>
       </w:r>
     </w:p>
     <w:p>
@@ -121,31 +86,31 @@
           <w:szCs w:val="28"/>
           <w:lang w:val="en-US" w:eastAsia="ru-RU"/>
         </w:rPr>
-        <w:t>MINUTES No. 11</w:t>
-      </w:r>
-    </w:p>
-    <w:p>
-      <w:pPr>
-        <w:spacing w:after="0" w:line="360" w:lineRule="auto"/>
-        <w:ind w:firstLine="567"/>
-        <w:jc w:val="both"/>
-        <w:rPr>
-          <w:rFonts w:ascii="Times New Roman" w:eastAsia="Times New Roman" w:hAnsi="Times New Roman" w:cs="Times New Roman"/>
-          <w:sz w:val="28"/>
-          <w:szCs w:val="28"/>
-          <w:lang w:val="en-US" w:eastAsia="ru-RU"/>
-        </w:rPr>
-      </w:pPr>
-      <w:r>
-        <w:rPr>
-          <w:rFonts w:ascii="Times New Roman" w:eastAsia="Times New Roman" w:hAnsi="Times New Roman" w:cs="Times New Roman"/>
-          <w:b/>
-          <w:bCs/>
-          <w:sz w:val="28"/>
-          <w:szCs w:val="28"/>
-          <w:lang w:val="en-US" w:eastAsia="ru-RU"/>
-        </w:rPr>
-        <w:t xml:space="preserve">27 June 2026                                                                        Termez city</w:t>
+        <w:t>BAYONNOMA № 11</w:t>
+      </w:r>
+    </w:p>
+    <w:p>
+      <w:pPr>
+        <w:spacing w:after="0" w:line="360" w:lineRule="auto"/>
+        <w:ind w:firstLine="567"/>
+        <w:jc w:val="both"/>
+        <w:rPr>
+          <w:rFonts w:ascii="Times New Roman" w:eastAsia="Times New Roman" w:hAnsi="Times New Roman" w:cs="Times New Roman"/>
+          <w:sz w:val="28"/>
+          <w:szCs w:val="28"/>
+          <w:lang w:val="en-US" w:eastAsia="ru-RU"/>
+        </w:rPr>
+      </w:pPr>
+      <w:r>
+        <w:rPr>
+          <w:rFonts w:ascii="Times New Roman" w:eastAsia="Times New Roman" w:hAnsi="Times New Roman" w:cs="Times New Roman"/>
+          <w:b/>
+          <w:bCs/>
+          <w:sz w:val="28"/>
+          <w:szCs w:val="28"/>
+          <w:lang w:val="en-US" w:eastAsia="ru-RU"/>
+        </w:rPr>
+        <w:t>2026-yil 27-iyun                                                                        Termiz shahri</w:t>
       </w:r>
     </w:p>
     <w:p>
@@ -168,7 +133,7 @@
           <w:szCs w:val="28"/>
           <w:lang w:val="en-US" w:eastAsia="ru-RU"/>
         </w:rPr>
-        <w:t xml:space="preserve">Chairperson: Djumayev Farrukh Toshmuratovich – Dean of the Faculty of Information Technologies, Chairperson of the Faculty Council.</w:t>
+        <w:t>Rais: Djumayev Farrux Toshmuratovich – Axborot texnologiyalari fakulteti dekani, Fakultet kengashi raisi.</w:t>
       </w:r>
     </w:p>
     <w:p>
@@ -191,7 +156,7 @@
           <w:szCs w:val="28"/>
           <w:lang w:val="en-US" w:eastAsia="ru-RU"/>
         </w:rPr>
-        <w:t xml:space="preserve">Secretary: Abdullayev Bakhtiyor Panji o'g'li – Senior Lecturer, Department of Mathematical Modeling and Computer Sciences.</w:t>
+        <w:t>Kotib: Abdullayev Baxtiyor Panji o'g'li – Matematik modellashtirish va kompyuter fanlari kafedrasi katta o'qituvchisi.</w:t>
       </w:r>
     </w:p>
     <w:p>
@@ -214,7 +179,7 @@
           <w:szCs w:val="28"/>
           <w:lang w:val="en-US" w:eastAsia="ru-RU"/>
         </w:rPr>
-        <w:t>Present:</w:t>
+        <w:t>Ishtirok etganlar:</w:t>
       </w:r>
     </w:p>
     <w:p>
@@ -237,7 +202,7 @@
           <w:szCs w:val="28"/>
           <w:lang w:val="en-US" w:eastAsia="ru-RU"/>
         </w:rPr>
-        <w:t xml:space="preserve">Members of the Faculty Council: Djumayev F.T., Abdullayev B.P., Makhmudov T.D., Abdullayev M.K., Babakulova D.I., G'ulomqodirov K.A., Yuldashev Sh.M., Jo'rayev O.A., Normurodov Ch.B., Khatamov O.Q., Choriyev I.K., Amirov S.T., Khushvaqtov U.Kh., Nazarova M.B., Mamataliyev H.B., Jurayev J.R., Sattorov B.R., Karshiyev S.E., Hakimov S.T., Eshpo'latov M., Egamberdiyev A.J., Mamatmurodova N.A.</w:t>
+        <w:t>Fakultet kengashi a'zolari: Djumayev F.T., Abdullayev B.P., Maxmudov T.D., Abdullayev M.K., Babakulova D.I., G'ulomqodirov K.A., Yuldashev Sh.M., Jo'rayev O.A., Normurodov Ch.B., Xatamov O.Q., Choriyev I.K., Amirov S.T., Xushvaqtov U.X., Nazarova M.B., Mamataliyev H.B., Jurayev J.R., Sattorov B.R., Karshiyev S.E., Hakimov S.T., Eshpo'latov M., Egamberdiyev A.J., Mamatmurodova N.A.</w:t>
       </w:r>
     </w:p>
     <w:p>
@@ -266,7 +231,7 @@
           <w:szCs w:val="28"/>
           <w:lang w:eastAsia="ru-RU"/>
         </w:rPr>
-        <w:t>AGENDA</w:t>
+        <w:t>KUN TARTIBI</w:t>
       </w:r>
     </w:p>
     <w:p>
@@ -296,7 +261,7 @@
           <w:szCs w:val="28"/>
           <w:lang w:val="en-US" w:eastAsia="ru-RU"/>
         </w:rPr>
-        <w:t xml:space="preserve">On the organization of the educational process at the faculty during the 2025/2026 academic year and the final outcomes of educational quality.</w:t>
+        <w:t>2025/2026 o'quv yilida fakultetda o'quv jarayonini tashkil etish va ta'lim sifatining yakuniy natijalari to'g'risida.</w:t>
       </w:r>
     </w:p>
     <w:p>
@@ -326,7 +291,7 @@
           <w:szCs w:val="28"/>
           <w:lang w:val="en-US" w:eastAsia="ru-RU"/>
         </w:rPr>
-        <w:t xml:space="preserve">On students' academic performance indicators, the level of course completion, GPA, and the formation of learning outcomes.</w:t>
+        <w:t>Talabalarning o'zlashtirish ko'rsatkichlari, fanlarni o'zlashtirish darajasi, o'rtacha ball (GPA) va o'quv natijalarining shakllanishi to'g'risida.</w:t>
       </w:r>
     </w:p>
     <w:p>
@@ -356,7 +321,7 @@
           <w:szCs w:val="28"/>
           <w:lang w:val="en-US" w:eastAsia="ru-RU"/>
         </w:rPr>
-        <w:t xml:space="preserve">On students' attendance indicators, academic support activities, and the effectiveness of tutoring activity.</w:t>
+        <w:t>Talabalarning davomat ko'rsatkichlari, akademik qo'llab-quvvatlash tadbirlari va tyutor faoliyatining samaradorligi to'g'risida.</w:t>
       </w:r>
     </w:p>
     <w:p>
@@ -386,7 +351,7 @@
           <w:szCs w:val="28"/>
           <w:lang w:val="en-US" w:eastAsia="ru-RU"/>
         </w:rPr>
-        <w:t xml:space="preserve">On the feedback of students, graduates, and employers regarding the improvement of the faculty's educational process and curricula.</w:t>
+        <w:t>Fakultetning o'quv jarayoni va o'quv rejalarini takomillashtirish bo'yicha talabalar, bitiruvchilar va ish beruvchilarning fikr-mulohazalari to'g'risida.</w:t>
       </w:r>
     </w:p>
     <w:p>
@@ -416,7 +381,7 @@
           <w:szCs w:val="28"/>
           <w:lang w:val="en-US" w:eastAsia="ru-RU"/>
         </w:rPr>
-        <w:t xml:space="preserve">On the teaching of elective courses, the process of course selection by students, and the improvement of the elective course catalog.</w:t>
+        <w:t>Tanlov fanlarini o'qitish, talabalarning fan tanlash jarayoni va tanlov fanlari katalogini takomillashtirish to'g'risida.</w:t>
       </w:r>
     </w:p>
     <w:p>
@@ -446,7 +411,7 @@
           <w:szCs w:val="28"/>
           <w:lang w:val="en-US" w:eastAsia="ru-RU"/>
         </w:rPr>
-        <w:t xml:space="preserve">On the outcomes of faculty members' pedagogical, research, and professional development activities.</w:t>
+        <w:t>Professor-o'qituvchilarning pedagogik, ilmiy va malaka oshirish faoliyati natijalari to'g'risida.</w:t>
       </w:r>
     </w:p>
     <w:p>
@@ -476,8 +441,7 @@
           <w:szCs w:val="28"/>
           <w:lang w:val="en-US" w:eastAsia="ru-RU"/>
         </w:rPr>
-        <w:lastRenderedPageBreak/>
-        <w:t xml:space="preserve">On ensuring internal quality assurance at the faculty, monitoring educational programs, and improvement measures for the 2026/2027 academic year.</w:t>
+        <w:t>Fakultetda ichki sifat ta'minlashni amalga oshirish, ta'lim dasturlarini monitoring qilish va 2026/2027 o'quv yili uchun takomillashtirish choralari to'g'risida.</w:t>
       </w:r>
     </w:p>
     <w:p>
@@ -504,7 +468,7 @@
           <w:szCs w:val="28"/>
           <w:lang w:val="en-US" w:eastAsia="ru-RU"/>
         </w:rPr>
-        <w:t>HEARD:</w:t>
+        <w:t>TINGLANDI:</w:t>
       </w:r>
     </w:p>
     <w:p>
@@ -527,93 +491,91 @@
           <w:szCs w:val="28"/>
           <w:lang w:val="en-US" w:eastAsia="ru-RU"/>
         </w:rPr>
-        <w:t xml:space="preserve">On the first item of the agenda</w:t>
-      </w:r>
-    </w:p>
-    <w:p>
-      <w:pPr>
-        <w:spacing w:after="0" w:line="360" w:lineRule="auto"/>
-        <w:ind w:firstLine="567"/>
-        <w:jc w:val="both"/>
-        <w:rPr>
-          <w:rFonts w:ascii="Times New Roman" w:eastAsia="Times New Roman" w:hAnsi="Times New Roman" w:cs="Times New Roman"/>
-          <w:sz w:val="28"/>
-          <w:szCs w:val="28"/>
-          <w:lang w:val="en-US" w:eastAsia="ru-RU"/>
-        </w:rPr>
-      </w:pPr>
-      <w:r>
-        <w:rPr>
-          <w:rFonts w:ascii="Times New Roman" w:eastAsia="Times New Roman" w:hAnsi="Times New Roman" w:cs="Times New Roman"/>
-          <w:sz w:val="28"/>
-          <w:szCs w:val="28"/>
-          <w:lang w:val="en-US" w:eastAsia="ru-RU"/>
-        </w:rPr>
-        <w:t xml:space="preserve">Dean of the Faculty </w:t>
-      </w:r>
-      <w:r>
-        <w:rPr>
-          <w:rFonts w:ascii="Times New Roman" w:eastAsia="Times New Roman" w:hAnsi="Times New Roman" w:cs="Times New Roman"/>
-          <w:b/>
-          <w:bCs/>
-          <w:sz w:val="28"/>
-          <w:szCs w:val="28"/>
-          <w:lang w:val="en-US" w:eastAsia="ru-RU"/>
-        </w:rPr>
-        <w:t xml:space="preserve">Djumayev F.T.</w:t>
-      </w:r>
-      <w:r>
-        <w:rPr>
-          <w:rFonts w:ascii="Times New Roman" w:eastAsia="Times New Roman" w:hAnsi="Times New Roman" w:cs="Times New Roman"/>
-          <w:sz w:val="28"/>
-          <w:szCs w:val="28"/>
-          <w:lang w:val="en-US" w:eastAsia="ru-RU"/>
-        </w:rPr>
-        <w:t xml:space="preserve"> took the floor and stated that, during the 2025/2026 academic year, the educational process at the faculty had been organized on the basis of the approved curricula, course programs, syllabi, and the academic calendar.</w:t>
-      </w:r>
-    </w:p>
-    <w:p>
-      <w:pPr>
-        <w:spacing w:after="0" w:line="360" w:lineRule="auto"/>
-        <w:ind w:firstLine="567"/>
-        <w:jc w:val="both"/>
-        <w:rPr>
-          <w:rFonts w:ascii="Times New Roman" w:eastAsia="Times New Roman" w:hAnsi="Times New Roman" w:cs="Times New Roman"/>
-          <w:sz w:val="28"/>
-          <w:szCs w:val="28"/>
-          <w:lang w:val="en-US" w:eastAsia="ru-RU"/>
-        </w:rPr>
-      </w:pPr>
-      <w:r>
-        <w:rPr>
-          <w:rFonts w:ascii="Times New Roman" w:eastAsia="Times New Roman" w:hAnsi="Times New Roman" w:cs="Times New Roman"/>
-          <w:sz w:val="28"/>
-          <w:szCs w:val="28"/>
-          <w:lang w:val="en-US" w:eastAsia="ru-RU"/>
-        </w:rPr>
-        <w:t>It was noted that classes had been organized in the form of lectures, practical sessions, laboratory work, and independent study, that modern pedagogical and information technologies had been used, and that particular attention had been paid to developing students' practical skills.</w:t>
-      </w:r>
-    </w:p>
-    <w:p>
-      <w:pPr>
-        <w:spacing w:after="0" w:line="360" w:lineRule="auto"/>
-        <w:ind w:firstLine="567"/>
-        <w:jc w:val="both"/>
-        <w:rPr>
-          <w:rFonts w:ascii="Times New Roman" w:eastAsia="Times New Roman" w:hAnsi="Times New Roman" w:cs="Times New Roman"/>
-          <w:sz w:val="28"/>
-          <w:szCs w:val="28"/>
-          <w:lang w:val="en-US" w:eastAsia="ru-RU"/>
-        </w:rPr>
-      </w:pPr>
-      <w:r>
-        <w:rPr>
-          <w:rFonts w:ascii="Times New Roman" w:eastAsia="Times New Roman" w:hAnsi="Times New Roman" w:cs="Times New Roman"/>
-          <w:sz w:val="28"/>
-          <w:szCs w:val="28"/>
-          <w:lang w:val="en-US" w:eastAsia="ru-RU"/>
-        </w:rPr>
-        <w:t>It was further reported that the content of educational programs had been continuously aligned with labor market requirements in the fields of modern information technologies, software engineering, artificial intelligence, databases, Big Data, computer networks, and other contemporary areas.</w:t>
+        <w:t>Kun tartibining birinchi masalasi bo'yicha</w:t>
+      </w:r>
+    </w:p>
+    <w:p>
+      <w:pPr>
+        <w:spacing w:after="0" w:line="360" w:lineRule="auto"/>
+        <w:ind w:firstLine="567"/>
+        <w:jc w:val="both"/>
+        <w:rPr>
+          <w:rFonts w:ascii="Times New Roman" w:eastAsia="Times New Roman" w:hAnsi="Times New Roman" w:cs="Times New Roman"/>
+          <w:sz w:val="28"/>
+          <w:szCs w:val="28"/>
+          <w:lang w:val="en-US" w:eastAsia="ru-RU"/>
+        </w:rPr>
+      </w:pPr>
+      <w:r>
+        <w:rPr>
+          <w:rFonts w:ascii="Times New Roman" w:eastAsia="Times New Roman" w:hAnsi="Times New Roman" w:cs="Times New Roman"/>
+          <w:sz w:val="28"/>
+          <w:szCs w:val="28"/>
+          <w:lang w:val="en-US" w:eastAsia="ru-RU"/>
+        </w:rPr>
+        <w:t>Fakultet dekani Djumayev F.T. so'zga chiqib, 2025/2026 o'quv yilida fakultetda o'quv jarayoni tasdiqlangan o'quv rejalari, fan dasturlari, sillabuslar va akademik taqvim asosida tashkil etilganligini ma'lum qildi.</w:t>
+      </w:r>
+      <w:r>
+        <w:rPr>
+          <w:rFonts w:ascii="Times New Roman" w:eastAsia="Times New Roman" w:hAnsi="Times New Roman" w:cs="Times New Roman"/>
+          <w:b/>
+          <w:bCs/>
+          <w:sz w:val="28"/>
+          <w:szCs w:val="28"/>
+          <w:lang w:val="en-US" w:eastAsia="ru-RU"/>
+        </w:rPr>
+      </w:r>
+      <w:r>
+        <w:rPr>
+          <w:rFonts w:ascii="Times New Roman" w:eastAsia="Times New Roman" w:hAnsi="Times New Roman" w:cs="Times New Roman"/>
+          <w:sz w:val="28"/>
+          <w:szCs w:val="28"/>
+          <w:lang w:val="en-US" w:eastAsia="ru-RU"/>
+        </w:rPr>
+      </w:r>
+    </w:p>
+    <w:p>
+      <w:pPr>
+        <w:spacing w:after="0" w:line="360" w:lineRule="auto"/>
+        <w:ind w:firstLine="567"/>
+        <w:jc w:val="both"/>
+        <w:rPr>
+          <w:rFonts w:ascii="Times New Roman" w:eastAsia="Times New Roman" w:hAnsi="Times New Roman" w:cs="Times New Roman"/>
+          <w:sz w:val="28"/>
+          <w:szCs w:val="28"/>
+          <w:lang w:val="en-US" w:eastAsia="ru-RU"/>
+        </w:rPr>
+      </w:pPr>
+      <w:r>
+        <w:rPr>
+          <w:rFonts w:ascii="Times New Roman" w:eastAsia="Times New Roman" w:hAnsi="Times New Roman" w:cs="Times New Roman"/>
+          <w:sz w:val="28"/>
+          <w:szCs w:val="28"/>
+          <w:lang w:val="en-US" w:eastAsia="ru-RU"/>
+        </w:rPr>
+        <w:t>Ma'ruzalar, amaliy mashg'ulotlar, laboratoriya ishlari va mustaqil ta'lim shaklida darslar tashkil etilganligi, zamonaviy pedagogik va axborot texnologiyalaridan foydalanilganligi hamda talabalarning amaliy ko'nikmalarini rivojlantirishga alohida e'tibor qaratilganligi ta'kidlandi.</w:t>
+      </w:r>
+    </w:p>
+    <w:p>
+      <w:pPr>
+        <w:spacing w:after="0" w:line="360" w:lineRule="auto"/>
+        <w:ind w:firstLine="567"/>
+        <w:jc w:val="both"/>
+        <w:rPr>
+          <w:rFonts w:ascii="Times New Roman" w:eastAsia="Times New Roman" w:hAnsi="Times New Roman" w:cs="Times New Roman"/>
+          <w:sz w:val="28"/>
+          <w:szCs w:val="28"/>
+          <w:lang w:val="en-US" w:eastAsia="ru-RU"/>
+        </w:rPr>
+      </w:pPr>
+      <w:r>
+        <w:rPr>
+          <w:rFonts w:ascii="Times New Roman" w:eastAsia="Times New Roman" w:hAnsi="Times New Roman" w:cs="Times New Roman"/>
+          <w:sz w:val="28"/>
+          <w:szCs w:val="28"/>
+          <w:lang w:val="en-US" w:eastAsia="ru-RU"/>
+        </w:rPr>
+        <w:t>Bundan tashqari, ta'lim dasturlari mazmuni zamonaviy axborot texnologiyalari, dasturiy ta'minot muhandisligi, sun'iy intellekt, ma'lumotlar bazalari, katta hajmli ma'lumotlar (Big Data), kompyuter tarmoqlari va boshqa zamonaviy yo'nalishlar bo'yicha mehnat bozori talablariga uzluksiz moslashtirilganligi xabar berildi.</w:t>
       </w:r>
     </w:p>
     <w:p>
@@ -640,62 +602,61 @@
           <w:szCs w:val="28"/>
           <w:lang w:val="en-US" w:eastAsia="ru-RU"/>
         </w:rPr>
-        <w:t>SPEECH OF THE EMPLOYER REPRESENTATIVE:</w:t>
-      </w:r>
-    </w:p>
-    <w:p>
-      <w:pPr>
-        <w:spacing w:after="0" w:line="360" w:lineRule="auto"/>
-        <w:ind w:firstLine="567"/>
-        <w:jc w:val="both"/>
-        <w:rPr>
-          <w:rFonts w:ascii="Times New Roman" w:eastAsia="Times New Roman" w:hAnsi="Times New Roman" w:cs="Times New Roman"/>
-          <w:sz w:val="28"/>
-          <w:szCs w:val="28"/>
-          <w:lang w:val="en-US" w:eastAsia="ru-RU"/>
-        </w:rPr>
-      </w:pPr>
-      <w:r>
-        <w:rPr>
-          <w:rFonts w:ascii="Times New Roman" w:eastAsia="Times New Roman" w:hAnsi="Times New Roman" w:cs="Times New Roman"/>
-          <w:b/>
-          <w:bCs/>
-          <w:sz w:val="28"/>
-          <w:szCs w:val="28"/>
-          <w:lang w:val="en-US" w:eastAsia="ru-RU"/>
-        </w:rPr>
-        <w:t>________________________</w:t>
-      </w:r>
-      <w:r>
-        <w:rPr>
-          <w:rFonts w:ascii="Times New Roman" w:eastAsia="Times New Roman" w:hAnsi="Times New Roman" w:cs="Times New Roman"/>
-          <w:sz w:val="28"/>
-          <w:szCs w:val="28"/>
-          <w:lang w:val="en-US" w:eastAsia="ru-RU"/>
-        </w:rPr>
-        <w:t xml:space="preserve">, representative of an employer organization:</w:t>
-      </w:r>
-    </w:p>
-    <w:p>
-      <w:pPr>
-        <w:spacing w:after="0" w:line="360" w:lineRule="auto"/>
-        <w:ind w:firstLine="567"/>
-        <w:jc w:val="both"/>
-        <w:rPr>
-          <w:rFonts w:ascii="Times New Roman" w:eastAsia="Times New Roman" w:hAnsi="Times New Roman" w:cs="Times New Roman"/>
-          <w:sz w:val="28"/>
-          <w:szCs w:val="28"/>
-          <w:lang w:val="en-US" w:eastAsia="ru-RU"/>
-        </w:rPr>
-      </w:pPr>
-      <w:r>
-        <w:rPr>
-          <w:rFonts w:ascii="Times New Roman" w:eastAsia="Times New Roman" w:hAnsi="Times New Roman" w:cs="Times New Roman"/>
-          <w:sz w:val="28"/>
-          <w:szCs w:val="28"/>
-          <w:lang w:val="en-US" w:eastAsia="ru-RU"/>
-        </w:rPr>
-        <w:t xml:space="preserve">"Today, graduates entering employment in the field of information technologies are required to have not only theoretical knowledge but also the ability to independently solve practical problems, work in programming environments, function within a team, develop software products based on technical assignments, and quickly master modern technologies. For this reason, it is advisable to further strengthen the use of real projects, practical assignments, project-based learning, and integration with industry in the educational process."</w:t>
+        <w:t>ISH BERUVCHI VAKILINING NUTQI:</w:t>
+      </w:r>
+    </w:p>
+    <w:p>
+      <w:pPr>
+        <w:spacing w:after="0" w:line="360" w:lineRule="auto"/>
+        <w:ind w:firstLine="567"/>
+        <w:jc w:val="both"/>
+        <w:rPr>
+          <w:rFonts w:ascii="Times New Roman" w:eastAsia="Times New Roman" w:hAnsi="Times New Roman" w:cs="Times New Roman"/>
+          <w:sz w:val="28"/>
+          <w:szCs w:val="28"/>
+          <w:lang w:val="en-US" w:eastAsia="ru-RU"/>
+        </w:rPr>
+      </w:pPr>
+      <w:r>
+        <w:rPr>
+          <w:rFonts w:ascii="Times New Roman" w:eastAsia="Times New Roman" w:hAnsi="Times New Roman" w:cs="Times New Roman"/>
+          <w:b/>
+          <w:bCs/>
+          <w:sz w:val="28"/>
+          <w:szCs w:val="28"/>
+          <w:lang w:val="en-US" w:eastAsia="ru-RU"/>
+        </w:rPr>
+        <w:t>________________________, ish beruvchi tashkilot vakili:</w:t>
+      </w:r>
+      <w:r>
+        <w:rPr>
+          <w:rFonts w:ascii="Times New Roman" w:eastAsia="Times New Roman" w:hAnsi="Times New Roman" w:cs="Times New Roman"/>
+          <w:sz w:val="28"/>
+          <w:szCs w:val="28"/>
+          <w:lang w:val="en-US" w:eastAsia="ru-RU"/>
+        </w:rPr>
+      </w:r>
+    </w:p>
+    <w:p>
+      <w:pPr>
+        <w:spacing w:after="0" w:line="360" w:lineRule="auto"/>
+        <w:ind w:firstLine="567"/>
+        <w:jc w:val="both"/>
+        <w:rPr>
+          <w:rFonts w:ascii="Times New Roman" w:eastAsia="Times New Roman" w:hAnsi="Times New Roman" w:cs="Times New Roman"/>
+          <w:sz w:val="28"/>
+          <w:szCs w:val="28"/>
+          <w:lang w:val="en-US" w:eastAsia="ru-RU"/>
+        </w:rPr>
+      </w:pPr>
+      <w:r>
+        <w:rPr>
+          <w:rFonts w:ascii="Times New Roman" w:eastAsia="Times New Roman" w:hAnsi="Times New Roman" w:cs="Times New Roman"/>
+          <w:sz w:val="28"/>
+          <w:szCs w:val="28"/>
+          <w:lang w:val="en-US" w:eastAsia="ru-RU"/>
+        </w:rPr>
+        <w:t>"Bugungi kunda axborot texnologiyalari sohasida ishga joylashayotgan bitiruvchilardan nafaqat nazariy bilim, balki amaliy muammolarni mustaqil hal qilish, dasturlash muhitlarida ishlash, jamoada faoliyat yuritish, texnik topshiriq asosida dasturiy mahsulotlar ishlab chiqish va zamonaviy texnologiyalarni tez o'zlashtirish qobiliyati talab etiladi. Shu sababli, o'quv jarayonida real loyihalar, amaliy topshiriqlar, loyiha asosidagi ta'lim va sanoat bilan integratsiyadan foydalanishni yanada kuchaytirish maqsadga muvofiqdir."</w:t>
       </w:r>
     </w:p>
     <w:p>
@@ -722,64 +683,61 @@
           <w:szCs w:val="28"/>
           <w:lang w:val="en-US" w:eastAsia="ru-RU"/>
         </w:rPr>
-        <w:t>SPEECH OF THE STUDENT:</w:t>
-      </w:r>
-    </w:p>
-    <w:p>
-      <w:pPr>
-        <w:spacing w:after="0" w:line="360" w:lineRule="auto"/>
-        <w:ind w:firstLine="567"/>
-        <w:jc w:val="both"/>
-        <w:rPr>
-          <w:rFonts w:ascii="Times New Roman" w:eastAsia="Times New Roman" w:hAnsi="Times New Roman" w:cs="Times New Roman"/>
-          <w:sz w:val="28"/>
-          <w:szCs w:val="28"/>
-          <w:lang w:val="en-US" w:eastAsia="ru-RU"/>
-        </w:rPr>
-      </w:pPr>
-      <w:r>
-        <w:rPr>
-          <w:rFonts w:ascii="Times New Roman" w:eastAsia="Times New Roman" w:hAnsi="Times New Roman" w:cs="Times New Roman"/>
-          <w:b/>
-          <w:bCs/>
-          <w:sz w:val="28"/>
-          <w:szCs w:val="28"/>
-          <w:lang w:val="en-US" w:eastAsia="ru-RU"/>
-        </w:rPr>
-        <w:t>________________________</w:t>
-      </w:r>
-      <w:r>
-        <w:rPr>
-          <w:rFonts w:ascii="Times New Roman" w:eastAsia="Times New Roman" w:hAnsi="Times New Roman" w:cs="Times New Roman"/>
-          <w:sz w:val="28"/>
-          <w:szCs w:val="28"/>
-          <w:lang w:val="en-US" w:eastAsia="ru-RU"/>
-        </w:rPr>
-        <w:t xml:space="preserve">, student of the Faculty:</w:t>
-      </w:r>
-    </w:p>
-    <w:p>
-      <w:pPr>
-        <w:spacing w:after="0" w:line="360" w:lineRule="auto"/>
-        <w:ind w:firstLine="567"/>
-        <w:jc w:val="both"/>
-        <w:rPr>
-          <w:rFonts w:ascii="Times New Roman" w:eastAsia="Times New Roman" w:hAnsi="Times New Roman" w:cs="Times New Roman"/>
-          <w:sz w:val="28"/>
-          <w:szCs w:val="28"/>
-          <w:lang w:val="en-US" w:eastAsia="ru-RU"/>
-        </w:rPr>
-      </w:pPr>
-      <w:r>
-        <w:rPr>
-          <w:rFonts w:ascii="Times New Roman" w:eastAsia="Times New Roman" w:hAnsi="Times New Roman" w:cs="Times New Roman"/>
-          <w:sz w:val="28"/>
-          <w:szCs w:val="28"/>
-          <w:lang w:val="en-US" w:eastAsia="ru-RU"/>
-        </w:rPr>
-        <w:t xml:space="preserve">"It would be beneficial for students to have more opportunities in practical classes to work with real projects, use tools such as Git/GitHub, develop software products, and defend their own work. In addition, expanding the option to choose </w:t>
-        <w:lastRenderedPageBreak/>
-        <w:t xml:space="preserve">independent assignments in certain courses would increase students' interest."</w:t>
+        <w:t>TALABA NUTQI:</w:t>
+      </w:r>
+    </w:p>
+    <w:p>
+      <w:pPr>
+        <w:spacing w:after="0" w:line="360" w:lineRule="auto"/>
+        <w:ind w:firstLine="567"/>
+        <w:jc w:val="both"/>
+        <w:rPr>
+          <w:rFonts w:ascii="Times New Roman" w:eastAsia="Times New Roman" w:hAnsi="Times New Roman" w:cs="Times New Roman"/>
+          <w:sz w:val="28"/>
+          <w:szCs w:val="28"/>
+          <w:lang w:val="en-US" w:eastAsia="ru-RU"/>
+        </w:rPr>
+      </w:pPr>
+      <w:r>
+        <w:rPr>
+          <w:rFonts w:ascii="Times New Roman" w:eastAsia="Times New Roman" w:hAnsi="Times New Roman" w:cs="Times New Roman"/>
+          <w:b/>
+          <w:bCs/>
+          <w:sz w:val="28"/>
+          <w:szCs w:val="28"/>
+          <w:lang w:val="en-US" w:eastAsia="ru-RU"/>
+        </w:rPr>
+        <w:t>________________________, fakultet talabasi:</w:t>
+      </w:r>
+      <w:r>
+        <w:rPr>
+          <w:rFonts w:ascii="Times New Roman" w:eastAsia="Times New Roman" w:hAnsi="Times New Roman" w:cs="Times New Roman"/>
+          <w:sz w:val="28"/>
+          <w:szCs w:val="28"/>
+          <w:lang w:val="en-US" w:eastAsia="ru-RU"/>
+        </w:rPr>
+      </w:r>
+    </w:p>
+    <w:p>
+      <w:pPr>
+        <w:spacing w:after="0" w:line="360" w:lineRule="auto"/>
+        <w:ind w:firstLine="567"/>
+        <w:jc w:val="both"/>
+        <w:rPr>
+          <w:rFonts w:ascii="Times New Roman" w:eastAsia="Times New Roman" w:hAnsi="Times New Roman" w:cs="Times New Roman"/>
+          <w:sz w:val="28"/>
+          <w:szCs w:val="28"/>
+          <w:lang w:val="en-US" w:eastAsia="ru-RU"/>
+        </w:rPr>
+      </w:pPr>
+      <w:r>
+        <w:rPr>
+          <w:rFonts w:ascii="Times New Roman" w:eastAsia="Times New Roman" w:hAnsi="Times New Roman" w:cs="Times New Roman"/>
+          <w:sz w:val="28"/>
+          <w:szCs w:val="28"/>
+          <w:lang w:val="en-US" w:eastAsia="ru-RU"/>
+        </w:rPr>
+        <w:t>"Talabalar uchun amaliy mashg'ulotlarda real loyihalar bilan ishlash, Git/GitHub kabi vositalardan foydalanish, dasturiy mahsulotlar ishlab chiqish va o'z ishlarini himoya qilish imkoniyatlari ko'proq bo'lsa foydali bo'lar edi. Bundan tashqari, ba'zi fanlarda mustaqil topshiriqlarni tanlash imkoniyatini kengaytirish talabalarning qiziqishini oshiradi."</w:t>
       </w:r>
     </w:p>
     <w:p>
@@ -806,29 +764,29 @@
           <w:szCs w:val="28"/>
           <w:lang w:val="en-US" w:eastAsia="ru-RU"/>
         </w:rPr>
-        <w:t>DISCUSSED:</w:t>
-      </w:r>
-    </w:p>
-    <w:p>
-      <w:pPr>
-        <w:spacing w:after="0" w:line="360" w:lineRule="auto"/>
-        <w:ind w:firstLine="567"/>
-        <w:jc w:val="both"/>
-        <w:rPr>
-          <w:rFonts w:ascii="Times New Roman" w:eastAsia="Times New Roman" w:hAnsi="Times New Roman" w:cs="Times New Roman"/>
-          <w:sz w:val="28"/>
-          <w:szCs w:val="28"/>
-          <w:lang w:val="en-US" w:eastAsia="ru-RU"/>
-        </w:rPr>
-      </w:pPr>
-      <w:r>
-        <w:rPr>
-          <w:rFonts w:ascii="Times New Roman" w:eastAsia="Times New Roman" w:hAnsi="Times New Roman" w:cs="Times New Roman"/>
-          <w:sz w:val="28"/>
-          <w:szCs w:val="28"/>
-          <w:lang w:val="en-US" w:eastAsia="ru-RU"/>
-        </w:rPr>
-        <w:t xml:space="preserve">Council members emphasized the need to strengthen the integration of theory and practice in order to improve educational quality, to use real-world problems in practical classes, and to further develop students' project and research activities.</w:t>
+        <w:t>MUHOKAMA QILINDI:</w:t>
+      </w:r>
+    </w:p>
+    <w:p>
+      <w:pPr>
+        <w:spacing w:after="0" w:line="360" w:lineRule="auto"/>
+        <w:ind w:firstLine="567"/>
+        <w:jc w:val="both"/>
+        <w:rPr>
+          <w:rFonts w:ascii="Times New Roman" w:eastAsia="Times New Roman" w:hAnsi="Times New Roman" w:cs="Times New Roman"/>
+          <w:sz w:val="28"/>
+          <w:szCs w:val="28"/>
+          <w:lang w:val="en-US" w:eastAsia="ru-RU"/>
+        </w:rPr>
+      </w:pPr>
+      <w:r>
+        <w:rPr>
+          <w:rFonts w:ascii="Times New Roman" w:eastAsia="Times New Roman" w:hAnsi="Times New Roman" w:cs="Times New Roman"/>
+          <w:sz w:val="28"/>
+          <w:szCs w:val="28"/>
+          <w:lang w:val="en-US" w:eastAsia="ru-RU"/>
+        </w:rPr>
+        <w:t>Kengash a'zolari ta'lim sifatini oshirish uchun nazariya va amaliyot integratsiyasini kuchaytirish, amaliy mashg'ulotlarda real muammolardan foydalanish hamda talabalarning loyihaviy va tadqiqot faoliyatini yanada rivojlantirish zarurligini ta'kidladi.</w:t>
       </w:r>
     </w:p>
     <w:p>
@@ -855,7 +813,7 @@
           <w:szCs w:val="28"/>
           <w:lang w:eastAsia="ru-RU"/>
         </w:rPr>
-        <w:t>RESOLVED:</w:t>
+        <w:t>QAROR QILINDI:</w:t>
       </w:r>
     </w:p>
     <w:p>
@@ -881,7 +839,7 @@
           <w:szCs w:val="28"/>
           <w:lang w:eastAsia="ru-RU"/>
         </w:rPr>
-        <w:t xml:space="preserve">The work carried out in organizing the educational process at the faculty during the 2025/2026 academic year shall be deemed satisfactory.</w:t>
+        <w:t>2025/2026 o'quv yilida fakultetda o'quv jarayonini tashkil etish bo'yicha olib borilgan ish qoniqarli deb topilsin.</w:t>
       </w:r>
     </w:p>
     <w:p>
@@ -907,7 +865,7 @@
           <w:szCs w:val="28"/>
           <w:lang w:eastAsia="ru-RU"/>
         </w:rPr>
-        <w:t xml:space="preserve">The practice of using practice-oriented assignments, real projects, and modern software tools in classes shall be expanded.</w:t>
+        <w:t>Darslarda amaliyotga yo'naltirilgan topshiriqlar, real loyihalar va zamonaviy dasturiy vositalardan foydalanish amaliyoti kengaytirilsin.</w:t>
       </w:r>
     </w:p>
     <w:p>
@@ -933,7 +891,7 @@
           <w:szCs w:val="28"/>
           <w:lang w:eastAsia="ru-RU"/>
         </w:rPr>
-        <w:t xml:space="preserve">Employers' proposals regarding practical skills shall be taken into account in improving the content of courses.</w:t>
+        <w:t>Amaliy ko'nikmalarga oid ish beruvchilar takliflari fan mazmunini takomillashtirishda hisobga olinsin.</w:t>
       </w:r>
     </w:p>
     <w:p>
@@ -959,28 +917,27 @@
           <w:szCs w:val="28"/>
           <w:lang w:val="en-US" w:eastAsia="ru-RU"/>
         </w:rPr>
-        <w:t xml:space="preserve">Responsible: heads of departments.</w:t>
+        <w:t>Mas'ullar: kafedra mudirlari.</w:t>
         <w:br/>
-      </w:r>
-      <w:r>
-        <w:rPr>
-          <w:rFonts w:ascii="Times New Roman" w:eastAsia="Times New Roman" w:hAnsi="Times New Roman" w:cs="Times New Roman"/>
-          <w:b/>
-          <w:bCs/>
-          <w:sz w:val="28"/>
-          <w:szCs w:val="28"/>
-          <w:lang w:val="en-US" w:eastAsia="ru-RU"/>
-        </w:rPr>
-        <w:t>Deadline:</w:t>
-      </w:r>
-      <w:r>
-        <w:rPr>
-          <w:rFonts w:ascii="Times New Roman" w:eastAsia="Times New Roman" w:hAnsi="Times New Roman" w:cs="Times New Roman"/>
-          <w:sz w:val="28"/>
-          <w:szCs w:val="28"/>
-          <w:lang w:val="en-US" w:eastAsia="ru-RU"/>
-        </w:rPr>
-        <w:t xml:space="preserve"> during the 2026/2027 academic year.</w:t>
+        <w:t>Muddat: 2026/2027 o'quv yili davomida.</w:t>
+      </w:r>
+      <w:r>
+        <w:rPr>
+          <w:rFonts w:ascii="Times New Roman" w:eastAsia="Times New Roman" w:hAnsi="Times New Roman" w:cs="Times New Roman"/>
+          <w:b/>
+          <w:bCs/>
+          <w:sz w:val="28"/>
+          <w:szCs w:val="28"/>
+          <w:lang w:val="en-US" w:eastAsia="ru-RU"/>
+        </w:rPr>
+      </w:r>
+      <w:r>
+        <w:rPr>
+          <w:rFonts w:ascii="Times New Roman" w:eastAsia="Times New Roman" w:hAnsi="Times New Roman" w:cs="Times New Roman"/>
+          <w:sz w:val="28"/>
+          <w:szCs w:val="28"/>
+          <w:lang w:val="en-US" w:eastAsia="ru-RU"/>
+        </w:rPr>
       </w:r>
     </w:p>
     <w:p>
@@ -1007,7 +964,7 @@
           <w:szCs w:val="28"/>
           <w:lang w:val="en-US" w:eastAsia="ru-RU"/>
         </w:rPr>
-        <w:t>HEARD:</w:t>
+        <w:t>TINGLANDI:</w:t>
       </w:r>
     </w:p>
     <w:p>
@@ -1030,71 +987,69 @@
           <w:szCs w:val="28"/>
           <w:lang w:val="en-US" w:eastAsia="ru-RU"/>
         </w:rPr>
-        <w:t xml:space="preserve">On the second item of the agenda</w:t>
-      </w:r>
-    </w:p>
-    <w:p>
-      <w:pPr>
-        <w:spacing w:after="0" w:line="360" w:lineRule="auto"/>
-        <w:ind w:firstLine="567"/>
-        <w:jc w:val="both"/>
-        <w:rPr>
-          <w:rFonts w:ascii="Times New Roman" w:eastAsia="Times New Roman" w:hAnsi="Times New Roman" w:cs="Times New Roman"/>
-          <w:sz w:val="28"/>
-          <w:szCs w:val="28"/>
-          <w:lang w:val="en-US" w:eastAsia="ru-RU"/>
-        </w:rPr>
-      </w:pPr>
-      <w:r>
-        <w:rPr>
-          <w:rFonts w:ascii="Times New Roman" w:eastAsia="Times New Roman" w:hAnsi="Times New Roman" w:cs="Times New Roman"/>
-          <w:sz w:val="28"/>
-          <w:szCs w:val="28"/>
-          <w:lang w:val="en-US" w:eastAsia="ru-RU"/>
-        </w:rPr>
-        <w:t xml:space="preserve">On this matter, </w:t>
-      </w:r>
-      <w:r>
-        <w:rPr>
-          <w:rFonts w:ascii="Times New Roman" w:eastAsia="Times New Roman" w:hAnsi="Times New Roman" w:cs="Times New Roman"/>
-          <w:b/>
-          <w:bCs/>
-          <w:sz w:val="28"/>
-          <w:szCs w:val="28"/>
-          <w:lang w:val="en-US" w:eastAsia="ru-RU"/>
-        </w:rPr>
-        <w:t>________________________</w:t>
-      </w:r>
-      <w:r>
-        <w:rPr>
-          <w:rFonts w:ascii="Times New Roman" w:eastAsia="Times New Roman" w:hAnsi="Times New Roman" w:cs="Times New Roman"/>
-          <w:sz w:val="28"/>
-          <w:szCs w:val="28"/>
-          <w:lang w:val="en-US" w:eastAsia="ru-RU"/>
-        </w:rPr>
-        <w:t xml:space="preserve"> presented information, reporting that students' course completion indicators, GPA results, final assessment results, and academic performance indicators by course for the 2025/2026 academic year had been analyzed.</w:t>
-      </w:r>
-    </w:p>
-    <w:p>
-      <w:pPr>
-        <w:spacing w:after="0" w:line="360" w:lineRule="auto"/>
-        <w:ind w:firstLine="567"/>
-        <w:jc w:val="both"/>
-        <w:rPr>
-          <w:rFonts w:ascii="Times New Roman" w:eastAsia="Times New Roman" w:hAnsi="Times New Roman" w:cs="Times New Roman"/>
-          <w:sz w:val="28"/>
-          <w:szCs w:val="28"/>
-          <w:lang w:val="en-US" w:eastAsia="ru-RU"/>
-        </w:rPr>
-      </w:pPr>
-      <w:r>
-        <w:rPr>
-          <w:rFonts w:ascii="Times New Roman" w:eastAsia="Times New Roman" w:hAnsi="Times New Roman" w:cs="Times New Roman"/>
-          <w:sz w:val="28"/>
-          <w:szCs w:val="28"/>
-          <w:lang w:val="en-US" w:eastAsia="ru-RU"/>
-        </w:rPr>
-        <w:t xml:space="preserve">It was noted that it is necessary to identify the causes of low performance in certain courses, to work individually with students, to organize additional consultations, and to strengthen academic support mechanisms.</w:t>
+        <w:t>Kun tartibining ikkinchi masalasi bo'yicha</w:t>
+      </w:r>
+    </w:p>
+    <w:p>
+      <w:pPr>
+        <w:spacing w:after="0" w:line="360" w:lineRule="auto"/>
+        <w:ind w:firstLine="567"/>
+        <w:jc w:val="both"/>
+        <w:rPr>
+          <w:rFonts w:ascii="Times New Roman" w:eastAsia="Times New Roman" w:hAnsi="Times New Roman" w:cs="Times New Roman"/>
+          <w:sz w:val="28"/>
+          <w:szCs w:val="28"/>
+          <w:lang w:val="en-US" w:eastAsia="ru-RU"/>
+        </w:rPr>
+      </w:pPr>
+      <w:r>
+        <w:rPr>
+          <w:rFonts w:ascii="Times New Roman" w:eastAsia="Times New Roman" w:hAnsi="Times New Roman" w:cs="Times New Roman"/>
+          <w:sz w:val="28"/>
+          <w:szCs w:val="28"/>
+          <w:lang w:val="en-US" w:eastAsia="ru-RU"/>
+        </w:rPr>
+        <w:t>Ushbu masala bo'yicha ________________________ ma'lumot taqdim etib, 2025/2026 o'quv yili uchun talabalarning fanlarni o'zlashtirish ko'rsatkichlari, GPA natijalari, yakuniy baholash natijalari va kurslar bo'yicha o'zlashtirish ko'rsatkichlari tahlil qilinganligi haqida xabar berdi.</w:t>
+      </w:r>
+      <w:r>
+        <w:rPr>
+          <w:rFonts w:ascii="Times New Roman" w:eastAsia="Times New Roman" w:hAnsi="Times New Roman" w:cs="Times New Roman"/>
+          <w:b/>
+          <w:bCs/>
+          <w:sz w:val="28"/>
+          <w:szCs w:val="28"/>
+          <w:lang w:val="en-US" w:eastAsia="ru-RU"/>
+        </w:rPr>
+      </w:r>
+      <w:r>
+        <w:rPr>
+          <w:rFonts w:ascii="Times New Roman" w:eastAsia="Times New Roman" w:hAnsi="Times New Roman" w:cs="Times New Roman"/>
+          <w:sz w:val="28"/>
+          <w:szCs w:val="28"/>
+          <w:lang w:val="en-US" w:eastAsia="ru-RU"/>
+        </w:rPr>
+      </w:r>
+    </w:p>
+    <w:p>
+      <w:pPr>
+        <w:spacing w:after="0" w:line="360" w:lineRule="auto"/>
+        <w:ind w:firstLine="567"/>
+        <w:jc w:val="both"/>
+        <w:rPr>
+          <w:rFonts w:ascii="Times New Roman" w:eastAsia="Times New Roman" w:hAnsi="Times New Roman" w:cs="Times New Roman"/>
+          <w:sz w:val="28"/>
+          <w:szCs w:val="28"/>
+          <w:lang w:val="en-US" w:eastAsia="ru-RU"/>
+        </w:rPr>
+      </w:pPr>
+      <w:r>
+        <w:rPr>
+          <w:rFonts w:ascii="Times New Roman" w:eastAsia="Times New Roman" w:hAnsi="Times New Roman" w:cs="Times New Roman"/>
+          <w:sz w:val="28"/>
+          <w:szCs w:val="28"/>
+          <w:lang w:val="en-US" w:eastAsia="ru-RU"/>
+        </w:rPr>
+        <w:t>Ayrim fanlarda past o'zlashtirish sabablarini aniqlash, talabalar bilan individual ishlash, qo'shimcha maslahatlar tashkil etish va akademik qo'llab-quvvatlash mexanizmlarini kuchaytirish zarurligi ta'kidlandi.</w:t>
       </w:r>
     </w:p>
     <w:p>
@@ -1121,29 +1076,29 @@
           <w:szCs w:val="28"/>
           <w:lang w:val="en-US" w:eastAsia="ru-RU"/>
         </w:rPr>
-        <w:t>SPEECH OF THE EMPLOYER REPRESENTATIVE:</w:t>
-      </w:r>
-    </w:p>
-    <w:p>
-      <w:pPr>
-        <w:spacing w:after="0" w:line="360" w:lineRule="auto"/>
-        <w:ind w:firstLine="567"/>
-        <w:jc w:val="both"/>
-        <w:rPr>
-          <w:rFonts w:ascii="Times New Roman" w:eastAsia="Times New Roman" w:hAnsi="Times New Roman" w:cs="Times New Roman"/>
-          <w:sz w:val="28"/>
-          <w:szCs w:val="28"/>
-          <w:lang w:val="en-US" w:eastAsia="ru-RU"/>
-        </w:rPr>
-      </w:pPr>
-      <w:r>
-        <w:rPr>
-          <w:rFonts w:ascii="Times New Roman" w:eastAsia="Times New Roman" w:hAnsi="Times New Roman" w:cs="Times New Roman"/>
-          <w:sz w:val="28"/>
-          <w:szCs w:val="28"/>
-          <w:lang w:val="en-US" w:eastAsia="ru-RU"/>
-        </w:rPr>
-        <w:t xml:space="preserve">"As an employer, what matters to us is not merely the grade recorded in a graduate's diploma, but their ability to apply their knowledge in practical situations. Therefore, the assessment process should also develop skills such as practical projects, portfolios, problem-solving, and independent work."</w:t>
+        <w:t>ISH BERUVCHI VAKILINING NUTQI:</w:t>
+      </w:r>
+    </w:p>
+    <w:p>
+      <w:pPr>
+        <w:spacing w:after="0" w:line="360" w:lineRule="auto"/>
+        <w:ind w:firstLine="567"/>
+        <w:jc w:val="both"/>
+        <w:rPr>
+          <w:rFonts w:ascii="Times New Roman" w:eastAsia="Times New Roman" w:hAnsi="Times New Roman" w:cs="Times New Roman"/>
+          <w:sz w:val="28"/>
+          <w:szCs w:val="28"/>
+          <w:lang w:val="en-US" w:eastAsia="ru-RU"/>
+        </w:rPr>
+      </w:pPr>
+      <w:r>
+        <w:rPr>
+          <w:rFonts w:ascii="Times New Roman" w:eastAsia="Times New Roman" w:hAnsi="Times New Roman" w:cs="Times New Roman"/>
+          <w:sz w:val="28"/>
+          <w:szCs w:val="28"/>
+          <w:lang w:val="en-US" w:eastAsia="ru-RU"/>
+        </w:rPr>
+        <w:t>"Ish beruvchi sifatida biz uchun muhimi bitiruvchining diplomida qayd etilgan bahosi emas, balki o'z bilimlarini amaliy vaziyatlarda qo'llash qobiliyatidir. Shu sababli, baholash jarayoni amaliy loyihalar, portfoliolar, muammolarni hal qilish va mustaqil ish kabi ko'nikmalarni ham rivojlantirishi kerak."</w:t>
       </w:r>
     </w:p>
     <w:p>
@@ -1170,30 +1125,29 @@
           <w:szCs w:val="28"/>
           <w:lang w:val="en-US" w:eastAsia="ru-RU"/>
         </w:rPr>
-        <w:lastRenderedPageBreak/>
-        <w:t>SPEECH OF THE STUDENT:</w:t>
-      </w:r>
-    </w:p>
-    <w:p>
-      <w:pPr>
-        <w:spacing w:after="0" w:line="360" w:lineRule="auto"/>
-        <w:ind w:firstLine="567"/>
-        <w:jc w:val="both"/>
-        <w:rPr>
-          <w:rFonts w:ascii="Times New Roman" w:eastAsia="Times New Roman" w:hAnsi="Times New Roman" w:cs="Times New Roman"/>
-          <w:sz w:val="28"/>
-          <w:szCs w:val="28"/>
-          <w:lang w:val="en-US" w:eastAsia="ru-RU"/>
-        </w:rPr>
-      </w:pPr>
-      <w:r>
-        <w:rPr>
-          <w:rFonts w:ascii="Times New Roman" w:eastAsia="Times New Roman" w:hAnsi="Times New Roman" w:cs="Times New Roman"/>
-          <w:sz w:val="28"/>
-          <w:szCs w:val="28"/>
-          <w:lang w:val="en-US" w:eastAsia="ru-RU"/>
-        </w:rPr>
-        <w:t xml:space="preserve">"It is very important for students that assessment criteria be provided clearly and in advance. When assignments, criteria, and final outcomes are clearly explained at the beginning of a course, students are able to plan their work accordingly. Organizing additional consultations for difficult courses would also be beneficial."</w:t>
+        <w:t>TALABA NUTQI:</w:t>
+      </w:r>
+    </w:p>
+    <w:p>
+      <w:pPr>
+        <w:spacing w:after="0" w:line="360" w:lineRule="auto"/>
+        <w:ind w:firstLine="567"/>
+        <w:jc w:val="both"/>
+        <w:rPr>
+          <w:rFonts w:ascii="Times New Roman" w:eastAsia="Times New Roman" w:hAnsi="Times New Roman" w:cs="Times New Roman"/>
+          <w:sz w:val="28"/>
+          <w:szCs w:val="28"/>
+          <w:lang w:val="en-US" w:eastAsia="ru-RU"/>
+        </w:rPr>
+      </w:pPr>
+      <w:r>
+        <w:rPr>
+          <w:rFonts w:ascii="Times New Roman" w:eastAsia="Times New Roman" w:hAnsi="Times New Roman" w:cs="Times New Roman"/>
+          <w:sz w:val="28"/>
+          <w:szCs w:val="28"/>
+          <w:lang w:val="en-US" w:eastAsia="ru-RU"/>
+        </w:rPr>
+        <w:t>"Talabalar uchun baholash mezonlarining aniq va oldindan berilishi juda muhimdir. Topshiriqlar, mezonlar va yakuniy natijalar fanning boshida aniq tushuntirilganda, talabalar o'z ishlarini shunga mos rejalashtira oladi. Murakkab fanlar uchun qo'shimcha maslahatlar tashkil etish ham foydali bo'lar edi."</w:t>
       </w:r>
     </w:p>
     <w:p>
@@ -1220,49 +1174,47 @@
           <w:szCs w:val="28"/>
           <w:lang w:val="en-US" w:eastAsia="ru-RU"/>
         </w:rPr>
-        <w:t>DISCUSSED:</w:t>
-      </w:r>
-    </w:p>
-    <w:p>
-      <w:pPr>
-        <w:spacing w:after="0" w:line="360" w:lineRule="auto"/>
-        <w:ind w:firstLine="567"/>
-        <w:jc w:val="both"/>
-        <w:rPr>
-          <w:rFonts w:ascii="Times New Roman" w:eastAsia="Times New Roman" w:hAnsi="Times New Roman" w:cs="Times New Roman"/>
-          <w:sz w:val="28"/>
-          <w:szCs w:val="28"/>
-          <w:lang w:val="en-US" w:eastAsia="ru-RU"/>
-        </w:rPr>
-      </w:pPr>
-      <w:r>
-        <w:rPr>
-          <w:rFonts w:ascii="Times New Roman" w:eastAsia="Times New Roman" w:hAnsi="Times New Roman" w:cs="Times New Roman"/>
-          <w:sz w:val="28"/>
-          <w:szCs w:val="28"/>
-          <w:lang w:val="en-US" w:eastAsia="ru-RU"/>
-        </w:rPr>
-        <w:t xml:space="preserve">Council members noted the need to analyze academic outcomes not solely on the basis of final grades, but together with the </w:t>
-      </w:r>
-      <w:r>
-        <w:rPr>
-          <w:rFonts w:ascii="Times New Roman" w:eastAsia="Times New Roman" w:hAnsi="Times New Roman" w:cs="Times New Roman"/>
-          <w:b/>
-          <w:bCs/>
-          <w:sz w:val="28"/>
-          <w:szCs w:val="28"/>
-          <w:lang w:val="en-US" w:eastAsia="ru-RU"/>
-        </w:rPr>
-        <w:t>Learning Outcomes</w:t>
-      </w:r>
-      <w:r>
-        <w:rPr>
-          <w:rFonts w:ascii="Times New Roman" w:eastAsia="Times New Roman" w:hAnsi="Times New Roman" w:cs="Times New Roman"/>
-          <w:sz w:val="28"/>
-          <w:szCs w:val="28"/>
-          <w:lang w:val="en-US" w:eastAsia="ru-RU"/>
-        </w:rPr>
-        <w:t xml:space="preserve">, competencies, and the level of practical skills acquired in each course.</w:t>
+        <w:t>MUHOKAMA QILINDI:</w:t>
+      </w:r>
+    </w:p>
+    <w:p>
+      <w:pPr>
+        <w:spacing w:after="0" w:line="360" w:lineRule="auto"/>
+        <w:ind w:firstLine="567"/>
+        <w:jc w:val="both"/>
+        <w:rPr>
+          <w:rFonts w:ascii="Times New Roman" w:eastAsia="Times New Roman" w:hAnsi="Times New Roman" w:cs="Times New Roman"/>
+          <w:sz w:val="28"/>
+          <w:szCs w:val="28"/>
+          <w:lang w:val="en-US" w:eastAsia="ru-RU"/>
+        </w:rPr>
+      </w:pPr>
+      <w:r>
+        <w:rPr>
+          <w:rFonts w:ascii="Times New Roman" w:eastAsia="Times New Roman" w:hAnsi="Times New Roman" w:cs="Times New Roman"/>
+          <w:sz w:val="28"/>
+          <w:szCs w:val="28"/>
+          <w:lang w:val="en-US" w:eastAsia="ru-RU"/>
+        </w:rPr>
+        <w:t>Kengash a'zolari akademik natijalarni faqat yakuniy baholar asosida emas, balki o'quv natijalari, kompetensiyalar va har bir fanda erishilgan amaliy ko'nikmalar darajasi bilan birga tahlil qilish zarurligini ta'kidladi.</w:t>
+      </w:r>
+      <w:r>
+        <w:rPr>
+          <w:rFonts w:ascii="Times New Roman" w:eastAsia="Times New Roman" w:hAnsi="Times New Roman" w:cs="Times New Roman"/>
+          <w:b/>
+          <w:bCs/>
+          <w:sz w:val="28"/>
+          <w:szCs w:val="28"/>
+          <w:lang w:val="en-US" w:eastAsia="ru-RU"/>
+        </w:rPr>
+      </w:r>
+      <w:r>
+        <w:rPr>
+          <w:rFonts w:ascii="Times New Roman" w:eastAsia="Times New Roman" w:hAnsi="Times New Roman" w:cs="Times New Roman"/>
+          <w:sz w:val="28"/>
+          <w:szCs w:val="28"/>
+          <w:lang w:val="en-US" w:eastAsia="ru-RU"/>
+        </w:rPr>
       </w:r>
     </w:p>
     <w:p>
@@ -1289,7 +1241,7 @@
           <w:szCs w:val="28"/>
           <w:lang w:eastAsia="ru-RU"/>
         </w:rPr>
-        <w:t>RESOLVED:</w:t>
+        <w:t>QAROR QILINDI:</w:t>
       </w:r>
     </w:p>
     <w:p>
@@ -1315,7 +1267,7 @@
           <w:szCs w:val="28"/>
           <w:lang w:val="en-US" w:eastAsia="ru-RU"/>
         </w:rPr>
-        <w:t xml:space="preserve">Students' academic outcomes shall be regularly analyzed by course and by educational program.</w:t>
+        <w:t>Talabalarning akademik natijalari fanlar va ta'lim dasturlari bo'yicha muntazam tahlil qilinsin.</w:t>
       </w:r>
     </w:p>
     <w:p>
@@ -1341,7 +1293,7 @@
           <w:szCs w:val="28"/>
           <w:lang w:val="en-US" w:eastAsia="ru-RU"/>
         </w:rPr>
-        <w:t xml:space="preserve">An analysis of the causes of low performance in courses with weak outcomes shall be carried out.</w:t>
+        <w:t>Past o'zlashtirish ko'rsatkichlariga ega fanlarda sabablar tahlili o'tkazilsin.</w:t>
       </w:r>
     </w:p>
     <w:p>
@@ -1367,7 +1319,7 @@
           <w:szCs w:val="28"/>
           <w:lang w:val="en-US" w:eastAsia="ru-RU"/>
         </w:rPr>
-        <w:t xml:space="preserve">Additional consultation and academic support activities for students shall be strengthened.</w:t>
+        <w:t>Talabalar uchun qo'shimcha maslahat va akademik qo'llab-quvvatlash tadbirlari kuchaytirilsin.</w:t>
       </w:r>
     </w:p>
     <w:p>
@@ -1393,7 +1345,7 @@
           <w:szCs w:val="28"/>
           <w:lang w:val="en-US" w:eastAsia="ru-RU"/>
         </w:rPr>
-        <w:t xml:space="preserve">The alignment between assessment criteria and Learning Outcomes shall be reviewed.</w:t>
+        <w:t>Baholash mezonlarining o'quv natijalariga muvofiqligini ko'rib chiqilsin.</w:t>
       </w:r>
     </w:p>
     <w:p>
@@ -1419,8 +1371,9 @@
           <w:szCs w:val="28"/>
           <w:lang w:val="en-US" w:eastAsia="ru-RU"/>
         </w:rPr>
-        <w:t xml:space="preserve">Responsible: heads of departments, course instructors, tutors.</w:t>
+        <w:t>Mas'ullar: kafedra mudirlari, fan o'qituvchilari, tyutorlar.</w:t>
         <w:br/>
+        <w:t>Muddat: uzluksiz.</w:t>
       </w:r>
       <w:r>
         <w:rPr>
@@ -1431,7 +1384,6 @@
           <w:szCs w:val="28"/>
           <w:lang w:eastAsia="ru-RU"/>
         </w:rPr>
-        <w:t>Deadline:</w:t>
       </w:r>
       <w:r>
         <w:rPr>
@@ -1440,7 +1392,6 @@
           <w:szCs w:val="28"/>
           <w:lang w:eastAsia="ru-RU"/>
         </w:rPr>
-        <w:t xml:space="preserve"> ongoing.</w:t>
       </w:r>
     </w:p>
     <w:p>
@@ -1467,7 +1418,7 @@
           <w:szCs w:val="28"/>
           <w:lang w:eastAsia="ru-RU"/>
         </w:rPr>
-        <w:t>HEARD:</w:t>
+        <w:t>TINGLANDI:</w:t>
       </w:r>
     </w:p>
     <w:p>
@@ -1490,51 +1441,51 @@
           <w:szCs w:val="28"/>
           <w:lang w:val="en-US" w:eastAsia="ru-RU"/>
         </w:rPr>
-        <w:t xml:space="preserve">On the third item of the agenda</w:t>
-      </w:r>
-    </w:p>
-    <w:p>
-      <w:pPr>
-        <w:spacing w:after="0" w:line="360" w:lineRule="auto"/>
-        <w:ind w:firstLine="567"/>
-        <w:jc w:val="both"/>
-        <w:rPr>
-          <w:rFonts w:ascii="Times New Roman" w:eastAsia="Times New Roman" w:hAnsi="Times New Roman" w:cs="Times New Roman"/>
-          <w:sz w:val="28"/>
-          <w:szCs w:val="28"/>
-          <w:lang w:val="en-US" w:eastAsia="ru-RU"/>
-        </w:rPr>
-      </w:pPr>
-      <w:r>
-        <w:rPr>
-          <w:rFonts w:ascii="Times New Roman" w:eastAsia="Times New Roman" w:hAnsi="Times New Roman" w:cs="Times New Roman"/>
-          <w:sz w:val="28"/>
-          <w:szCs w:val="28"/>
-          <w:lang w:val="en-US" w:eastAsia="ru-RU"/>
-        </w:rPr>
-        <w:t xml:space="preserve">Tutors presented information on the work carried out regarding students' attendance, engagement in the educational process, completion of independent study assignments, and academic difficulties.</w:t>
-      </w:r>
-    </w:p>
-    <w:p>
-      <w:pPr>
-        <w:spacing w:after="0" w:line="360" w:lineRule="auto"/>
-        <w:ind w:firstLine="567"/>
-        <w:jc w:val="both"/>
-        <w:rPr>
-          <w:rFonts w:ascii="Times New Roman" w:eastAsia="Times New Roman" w:hAnsi="Times New Roman" w:cs="Times New Roman"/>
-          <w:sz w:val="28"/>
-          <w:szCs w:val="28"/>
-          <w:lang w:val="en-US" w:eastAsia="ru-RU"/>
-        </w:rPr>
-      </w:pPr>
-      <w:r>
-        <w:rPr>
-          <w:rFonts w:ascii="Times New Roman" w:eastAsia="Times New Roman" w:hAnsi="Times New Roman" w:cs="Times New Roman"/>
-          <w:sz w:val="28"/>
-          <w:szCs w:val="28"/>
-          <w:lang w:val="en-US" w:eastAsia="ru-RU"/>
-        </w:rPr>
-        <w:t xml:space="preserve">It was noted that it is necessary to identify the factors contributing to declining attendance and to work individually with students experiencing difficulties.</w:t>
+        <w:t>Kun tartibining uchinchi masalasi bo'yicha</w:t>
+      </w:r>
+    </w:p>
+    <w:p>
+      <w:pPr>
+        <w:spacing w:after="0" w:line="360" w:lineRule="auto"/>
+        <w:ind w:firstLine="567"/>
+        <w:jc w:val="both"/>
+        <w:rPr>
+          <w:rFonts w:ascii="Times New Roman" w:eastAsia="Times New Roman" w:hAnsi="Times New Roman" w:cs="Times New Roman"/>
+          <w:sz w:val="28"/>
+          <w:szCs w:val="28"/>
+          <w:lang w:val="en-US" w:eastAsia="ru-RU"/>
+        </w:rPr>
+      </w:pPr>
+      <w:r>
+        <w:rPr>
+          <w:rFonts w:ascii="Times New Roman" w:eastAsia="Times New Roman" w:hAnsi="Times New Roman" w:cs="Times New Roman"/>
+          <w:sz w:val="28"/>
+          <w:szCs w:val="28"/>
+          <w:lang w:val="en-US" w:eastAsia="ru-RU"/>
+        </w:rPr>
+        <w:t>Tyutorlar talabalarning davomati, o'quv jarayoniga jalb etilishi, mustaqil ta'lim topshiriqlarining bajarilishi va akademik qiyinchiliklar bo'yicha olib borilgan ishlar haqida ma'lumot taqdim etdi.</w:t>
+      </w:r>
+    </w:p>
+    <w:p>
+      <w:pPr>
+        <w:spacing w:after="0" w:line="360" w:lineRule="auto"/>
+        <w:ind w:firstLine="567"/>
+        <w:jc w:val="both"/>
+        <w:rPr>
+          <w:rFonts w:ascii="Times New Roman" w:eastAsia="Times New Roman" w:hAnsi="Times New Roman" w:cs="Times New Roman"/>
+          <w:sz w:val="28"/>
+          <w:szCs w:val="28"/>
+          <w:lang w:val="en-US" w:eastAsia="ru-RU"/>
+        </w:rPr>
+      </w:pPr>
+      <w:r>
+        <w:rPr>
+          <w:rFonts w:ascii="Times New Roman" w:eastAsia="Times New Roman" w:hAnsi="Times New Roman" w:cs="Times New Roman"/>
+          <w:sz w:val="28"/>
+          <w:szCs w:val="28"/>
+          <w:lang w:val="en-US" w:eastAsia="ru-RU"/>
+        </w:rPr>
+        <w:t>Davomat pasayishiga ta'sir etuvchi omillarni aniqlash va qiyinchiliklarga duch kelayotgan talabalar bilan individual ishlash zarurligi ta'kidlandi.</w:t>
       </w:r>
     </w:p>
     <w:p>
@@ -1561,31 +1512,29 @@
           <w:szCs w:val="28"/>
           <w:lang w:val="en-US" w:eastAsia="ru-RU"/>
         </w:rPr>
-        <w:t>SPEECH OF THE STUDENT:</w:t>
-      </w:r>
-    </w:p>
-    <w:p>
-      <w:pPr>
-        <w:spacing w:after="0" w:line="360" w:lineRule="auto"/>
-        <w:ind w:firstLine="567"/>
-        <w:jc w:val="both"/>
-        <w:rPr>
-          <w:rFonts w:ascii="Times New Roman" w:eastAsia="Times New Roman" w:hAnsi="Times New Roman" w:cs="Times New Roman"/>
-          <w:sz w:val="28"/>
-          <w:szCs w:val="28"/>
-          <w:lang w:val="en-US" w:eastAsia="ru-RU"/>
-        </w:rPr>
-      </w:pPr>
-      <w:r>
-        <w:rPr>
-          <w:rFonts w:ascii="Times New Roman" w:eastAsia="Times New Roman" w:hAnsi="Times New Roman" w:cs="Times New Roman"/>
-          <w:sz w:val="28"/>
-          <w:szCs w:val="28"/>
-          <w:lang w:val="en-US" w:eastAsia="ru-RU"/>
-        </w:rPr>
-        <w:t xml:space="preserve">"Regular communication with tutors helps resolve students' problems more quickly. In particular, it would be advisable to further strengthen the system of individual advising and guidance </w:t>
-        <w:lastRenderedPageBreak/>
-        <w:t xml:space="preserve">for students experiencing academic difficulties."</w:t>
+        <w:t>TALABA NUTQI:</w:t>
+      </w:r>
+    </w:p>
+    <w:p>
+      <w:pPr>
+        <w:spacing w:after="0" w:line="360" w:lineRule="auto"/>
+        <w:ind w:firstLine="567"/>
+        <w:jc w:val="both"/>
+        <w:rPr>
+          <w:rFonts w:ascii="Times New Roman" w:eastAsia="Times New Roman" w:hAnsi="Times New Roman" w:cs="Times New Roman"/>
+          <w:sz w:val="28"/>
+          <w:szCs w:val="28"/>
+          <w:lang w:val="en-US" w:eastAsia="ru-RU"/>
+        </w:rPr>
+      </w:pPr>
+      <w:r>
+        <w:rPr>
+          <w:rFonts w:ascii="Times New Roman" w:eastAsia="Times New Roman" w:hAnsi="Times New Roman" w:cs="Times New Roman"/>
+          <w:sz w:val="28"/>
+          <w:szCs w:val="28"/>
+          <w:lang w:val="en-US" w:eastAsia="ru-RU"/>
+        </w:rPr>
+        <w:t>"Tyutorlar bilan muntazam muloqot talabalar muammolarini tezroq hal qilishga yordam beradi. Xususan, akademik qiyinchiliklarga duch kelayotgan talabalar uchun individual maslahat va yo'l-yo'riq ko'rsatish tizimini yanada kuchaytirish maqsadga muvofiq bo'lar edi."</w:t>
       </w:r>
     </w:p>
     <w:p>
@@ -1612,29 +1561,29 @@
           <w:szCs w:val="28"/>
           <w:lang w:val="en-US" w:eastAsia="ru-RU"/>
         </w:rPr>
-        <w:t>DISCUSSED:</w:t>
-      </w:r>
-    </w:p>
-    <w:p>
-      <w:pPr>
-        <w:spacing w:after="0" w:line="360" w:lineRule="auto"/>
-        <w:ind w:firstLine="567"/>
-        <w:jc w:val="both"/>
-        <w:rPr>
-          <w:rFonts w:ascii="Times New Roman" w:eastAsia="Times New Roman" w:hAnsi="Times New Roman" w:cs="Times New Roman"/>
-          <w:sz w:val="28"/>
-          <w:szCs w:val="28"/>
-          <w:lang w:val="en-US" w:eastAsia="ru-RU"/>
-        </w:rPr>
-      </w:pPr>
-      <w:r>
-        <w:rPr>
-          <w:rFonts w:ascii="Times New Roman" w:eastAsia="Times New Roman" w:hAnsi="Times New Roman" w:cs="Times New Roman"/>
-          <w:sz w:val="28"/>
-          <w:szCs w:val="28"/>
-          <w:lang w:val="en-US" w:eastAsia="ru-RU"/>
-        </w:rPr>
-        <w:t xml:space="preserve">It was emphasized that improving educational quality requires not only monitoring student attendance but also identifying its causes and providing academic support.</w:t>
+        <w:t>MUHOKAMA QILINDI:</w:t>
+      </w:r>
+    </w:p>
+    <w:p>
+      <w:pPr>
+        <w:spacing w:after="0" w:line="360" w:lineRule="auto"/>
+        <w:ind w:firstLine="567"/>
+        <w:jc w:val="both"/>
+        <w:rPr>
+          <w:rFonts w:ascii="Times New Roman" w:eastAsia="Times New Roman" w:hAnsi="Times New Roman" w:cs="Times New Roman"/>
+          <w:sz w:val="28"/>
+          <w:szCs w:val="28"/>
+          <w:lang w:val="en-US" w:eastAsia="ru-RU"/>
+        </w:rPr>
+      </w:pPr>
+      <w:r>
+        <w:rPr>
+          <w:rFonts w:ascii="Times New Roman" w:eastAsia="Times New Roman" w:hAnsi="Times New Roman" w:cs="Times New Roman"/>
+          <w:sz w:val="28"/>
+          <w:szCs w:val="28"/>
+          <w:lang w:val="en-US" w:eastAsia="ru-RU"/>
+        </w:rPr>
+        <w:t>Ta'lim sifatini oshirish uchun nafaqat talabalar davomatini nazorat qilish, balki uning sabablarini aniqlash va akademik qo'llab-quvvatlash ko'rsatish zarurligi ta'kidlandi.</w:t>
       </w:r>
     </w:p>
     <w:p>
@@ -1661,7 +1610,7 @@
           <w:szCs w:val="28"/>
           <w:lang w:eastAsia="ru-RU"/>
         </w:rPr>
-        <w:t>RESOLVED:</w:t>
+        <w:t>QAROR QILINDI:</w:t>
       </w:r>
     </w:p>
     <w:p>
@@ -1687,7 +1636,7 @@
           <w:szCs w:val="28"/>
           <w:lang w:val="en-US" w:eastAsia="ru-RU"/>
         </w:rPr>
-        <w:t xml:space="preserve">Attendance indicators shall be monitored on a regular basis.</w:t>
+        <w:t>Davomat ko'rsatkichlari muntazam ravishda monitoring qilinsin.</w:t>
       </w:r>
     </w:p>
     <w:p>
@@ -1713,7 +1662,7 @@
           <w:szCs w:val="28"/>
           <w:lang w:val="en-US" w:eastAsia="ru-RU"/>
         </w:rPr>
-        <w:t xml:space="preserve">Individual preventive and academic work shall be carried out with students experiencing attendance problems.</w:t>
+        <w:t>Davomat muammolariga ega talabalar bilan individual profilaktika va akademik ishlar olib borilsin.</w:t>
       </w:r>
     </w:p>
     <w:p>
@@ -1739,7 +1688,7 @@
           <w:szCs w:val="28"/>
           <w:lang w:val="en-US" w:eastAsia="ru-RU"/>
         </w:rPr>
-        <w:t xml:space="preserve">The mechanism for monitoring students' academic progress within tutoring activities shall be strengthened.</w:t>
+        <w:t>Tyutor faoliyati doirasida talabalarning akademik taraqqiyotini monitoring qilish mexanizmi kuchaytirilsin.</w:t>
       </w:r>
     </w:p>
     <w:p>
@@ -1765,7 +1714,7 @@
           <w:szCs w:val="28"/>
           <w:lang w:val="en-US" w:eastAsia="ru-RU"/>
         </w:rPr>
-        <w:t xml:space="preserve">Relevant supporting documentation regarding the work carried out shall be maintained.</w:t>
+        <w:t>Olib borilgan ishlar bo'yicha tegishli yordamchi hujjatlar yuritilsin.</w:t>
       </w:r>
     </w:p>
     <w:p>
@@ -1792,7 +1741,7 @@
           <w:szCs w:val="28"/>
           <w:lang w:val="en-US" w:eastAsia="ru-RU"/>
         </w:rPr>
-        <w:t>HEARD:</w:t>
+        <w:t>TINGLANDI:</w:t>
       </w:r>
     </w:p>
     <w:p>
@@ -1815,71 +1764,69 @@
           <w:szCs w:val="28"/>
           <w:lang w:val="en-US" w:eastAsia="ru-RU"/>
         </w:rPr>
-        <w:t xml:space="preserve">On the fourth item of the agenda</w:t>
-      </w:r>
-    </w:p>
-    <w:p>
-      <w:pPr>
-        <w:spacing w:after="0" w:line="360" w:lineRule="auto"/>
-        <w:ind w:firstLine="567"/>
-        <w:jc w:val="both"/>
-        <w:rPr>
-          <w:rFonts w:ascii="Times New Roman" w:eastAsia="Times New Roman" w:hAnsi="Times New Roman" w:cs="Times New Roman"/>
-          <w:sz w:val="28"/>
-          <w:szCs w:val="28"/>
-          <w:lang w:val="en-US" w:eastAsia="ru-RU"/>
-        </w:rPr>
-      </w:pPr>
-      <w:r>
-        <w:rPr>
-          <w:rFonts w:ascii="Times New Roman" w:eastAsia="Times New Roman" w:hAnsi="Times New Roman" w:cs="Times New Roman"/>
-          <w:sz w:val="28"/>
-          <w:szCs w:val="28"/>
-          <w:lang w:val="en-US" w:eastAsia="ru-RU"/>
-        </w:rPr>
-        <w:t xml:space="preserve">On this matter, Dean of the Faculty </w:t>
-      </w:r>
-      <w:r>
-        <w:rPr>
-          <w:rFonts w:ascii="Times New Roman" w:eastAsia="Times New Roman" w:hAnsi="Times New Roman" w:cs="Times New Roman"/>
-          <w:b/>
-          <w:bCs/>
-          <w:sz w:val="28"/>
-          <w:szCs w:val="28"/>
-          <w:lang w:val="en-US" w:eastAsia="ru-RU"/>
-        </w:rPr>
-        <w:t xml:space="preserve">Djumayev F.T.</w:t>
-      </w:r>
-      <w:r>
-        <w:rPr>
-          <w:rFonts w:ascii="Times New Roman" w:eastAsia="Times New Roman" w:hAnsi="Times New Roman" w:cs="Times New Roman"/>
-          <w:sz w:val="28"/>
-          <w:szCs w:val="28"/>
-          <w:lang w:val="en-US" w:eastAsia="ru-RU"/>
-        </w:rPr>
-        <w:t xml:space="preserve"> took the floor and emphasized that studying the proposals of students, graduates, and employers is one of the key means of improving the faculty's educational quality.</w:t>
-      </w:r>
-    </w:p>
-    <w:p>
-      <w:pPr>
-        <w:spacing w:after="0" w:line="360" w:lineRule="auto"/>
-        <w:ind w:firstLine="567"/>
-        <w:jc w:val="both"/>
-        <w:rPr>
-          <w:rFonts w:ascii="Times New Roman" w:eastAsia="Times New Roman" w:hAnsi="Times New Roman" w:cs="Times New Roman"/>
-          <w:sz w:val="28"/>
-          <w:szCs w:val="28"/>
-          <w:lang w:val="en-US" w:eastAsia="ru-RU"/>
-        </w:rPr>
-      </w:pPr>
-      <w:r>
-        <w:rPr>
-          <w:rFonts w:ascii="Times New Roman" w:eastAsia="Times New Roman" w:hAnsi="Times New Roman" w:cs="Times New Roman"/>
-          <w:sz w:val="28"/>
-          <w:szCs w:val="28"/>
-          <w:lang w:val="en-US" w:eastAsia="ru-RU"/>
-        </w:rPr>
-        <w:t xml:space="preserve">It was noted that proposals obtained through surveys, interviews, meetings, and other feedback channels should be systematically analyzed, and that corresponding changes should be introduced into curricula on the basis of the results.</w:t>
+        <w:t>Kun tartibining to'rtinchi masalasi bo'yicha</w:t>
+      </w:r>
+    </w:p>
+    <w:p>
+      <w:pPr>
+        <w:spacing w:after="0" w:line="360" w:lineRule="auto"/>
+        <w:ind w:firstLine="567"/>
+        <w:jc w:val="both"/>
+        <w:rPr>
+          <w:rFonts w:ascii="Times New Roman" w:eastAsia="Times New Roman" w:hAnsi="Times New Roman" w:cs="Times New Roman"/>
+          <w:sz w:val="28"/>
+          <w:szCs w:val="28"/>
+          <w:lang w:val="en-US" w:eastAsia="ru-RU"/>
+        </w:rPr>
+      </w:pPr>
+      <w:r>
+        <w:rPr>
+          <w:rFonts w:ascii="Times New Roman" w:eastAsia="Times New Roman" w:hAnsi="Times New Roman" w:cs="Times New Roman"/>
+          <w:sz w:val="28"/>
+          <w:szCs w:val="28"/>
+          <w:lang w:val="en-US" w:eastAsia="ru-RU"/>
+        </w:rPr>
+        <w:t>Ushbu masala bo'yicha fakultet dekani Djumayev F.T. so'zga chiqib, talabalar, bitiruvchilar va ish beruvchilar takliflarini o'rganish fakultetning ta'lim sifatini oshirishning asosiy vositalaridan biri ekanligini ta'kidladi.</w:t>
+      </w:r>
+      <w:r>
+        <w:rPr>
+          <w:rFonts w:ascii="Times New Roman" w:eastAsia="Times New Roman" w:hAnsi="Times New Roman" w:cs="Times New Roman"/>
+          <w:b/>
+          <w:bCs/>
+          <w:sz w:val="28"/>
+          <w:szCs w:val="28"/>
+          <w:lang w:val="en-US" w:eastAsia="ru-RU"/>
+        </w:rPr>
+      </w:r>
+      <w:r>
+        <w:rPr>
+          <w:rFonts w:ascii="Times New Roman" w:eastAsia="Times New Roman" w:hAnsi="Times New Roman" w:cs="Times New Roman"/>
+          <w:sz w:val="28"/>
+          <w:szCs w:val="28"/>
+          <w:lang w:val="en-US" w:eastAsia="ru-RU"/>
+        </w:rPr>
+      </w:r>
+    </w:p>
+    <w:p>
+      <w:pPr>
+        <w:spacing w:after="0" w:line="360" w:lineRule="auto"/>
+        <w:ind w:firstLine="567"/>
+        <w:jc w:val="both"/>
+        <w:rPr>
+          <w:rFonts w:ascii="Times New Roman" w:eastAsia="Times New Roman" w:hAnsi="Times New Roman" w:cs="Times New Roman"/>
+          <w:sz w:val="28"/>
+          <w:szCs w:val="28"/>
+          <w:lang w:val="en-US" w:eastAsia="ru-RU"/>
+        </w:rPr>
+      </w:pPr>
+      <w:r>
+        <w:rPr>
+          <w:rFonts w:ascii="Times New Roman" w:eastAsia="Times New Roman" w:hAnsi="Times New Roman" w:cs="Times New Roman"/>
+          <w:sz w:val="28"/>
+          <w:szCs w:val="28"/>
+          <w:lang w:val="en-US" w:eastAsia="ru-RU"/>
+        </w:rPr>
+        <w:t>So'rovnomalar, suhbatlar, uchrashuvlar va boshqa fikr-mulohaza kanallari orqali olingan takliflar tizimli ravishda tahlil qilinishi va natijalar asosida o'quv rejalariga tegishli o'zgartirishlar kiritilishi kerakligi ta'kidlandi.</w:t>
       </w:r>
     </w:p>
     <w:p>
@@ -1906,29 +1853,29 @@
           <w:szCs w:val="28"/>
           <w:lang w:val="en-US" w:eastAsia="ru-RU"/>
         </w:rPr>
-        <w:t>SPEECH OF THE EMPLOYER:</w:t>
-      </w:r>
-    </w:p>
-    <w:p>
-      <w:pPr>
-        <w:spacing w:after="0" w:line="360" w:lineRule="auto"/>
-        <w:ind w:firstLine="567"/>
-        <w:jc w:val="both"/>
-        <w:rPr>
-          <w:rFonts w:ascii="Times New Roman" w:eastAsia="Times New Roman" w:hAnsi="Times New Roman" w:cs="Times New Roman"/>
-          <w:sz w:val="28"/>
-          <w:szCs w:val="28"/>
-          <w:lang w:val="en-US" w:eastAsia="ru-RU"/>
-        </w:rPr>
-      </w:pPr>
-      <w:r>
-        <w:rPr>
-          <w:rFonts w:ascii="Times New Roman" w:eastAsia="Times New Roman" w:hAnsi="Times New Roman" w:cs="Times New Roman"/>
-          <w:sz w:val="28"/>
-          <w:szCs w:val="28"/>
-          <w:lang w:val="en-US" w:eastAsia="ru-RU"/>
-        </w:rPr>
-        <w:t xml:space="preserve">"Our proposal is to strengthen students' exposure to real processes at production enterprises and IT companies. Providing students with a real technical assignment during internships, with their results assessed at the end, would produce good results."</w:t>
+        <w:t>ISH BERUVCHI NUTQI:</w:t>
+      </w:r>
+    </w:p>
+    <w:p>
+      <w:pPr>
+        <w:spacing w:after="0" w:line="360" w:lineRule="auto"/>
+        <w:ind w:firstLine="567"/>
+        <w:jc w:val="both"/>
+        <w:rPr>
+          <w:rFonts w:ascii="Times New Roman" w:eastAsia="Times New Roman" w:hAnsi="Times New Roman" w:cs="Times New Roman"/>
+          <w:sz w:val="28"/>
+          <w:szCs w:val="28"/>
+          <w:lang w:val="en-US" w:eastAsia="ru-RU"/>
+        </w:rPr>
+      </w:pPr>
+      <w:r>
+        <w:rPr>
+          <w:rFonts w:ascii="Times New Roman" w:eastAsia="Times New Roman" w:hAnsi="Times New Roman" w:cs="Times New Roman"/>
+          <w:sz w:val="28"/>
+          <w:szCs w:val="28"/>
+          <w:lang w:val="en-US" w:eastAsia="ru-RU"/>
+        </w:rPr>
+        <w:t>"Bizning taklifimiz — talabalarning ishlab chiqarish korxonalari va IT kompaniyalaridagi real jarayonlar bilan tanishishini kuchaytirish. Amaliyot davrida talabalarga real texnik topshiriq berish va natijalarini oxirida baholash yaxshi natijalar beradi."</w:t>
       </w:r>
     </w:p>
     <w:p>
@@ -1955,31 +1902,29 @@
           <w:szCs w:val="28"/>
           <w:lang w:val="en-US" w:eastAsia="ru-RU"/>
         </w:rPr>
-        <w:t>SPEECH OF THE GRADUATE:</w:t>
-      </w:r>
-    </w:p>
-    <w:p>
-      <w:pPr>
-        <w:spacing w:after="0" w:line="360" w:lineRule="auto"/>
-        <w:ind w:firstLine="567"/>
-        <w:jc w:val="both"/>
-        <w:rPr>
-          <w:rFonts w:ascii="Times New Roman" w:eastAsia="Times New Roman" w:hAnsi="Times New Roman" w:cs="Times New Roman"/>
-          <w:sz w:val="28"/>
-          <w:szCs w:val="28"/>
-          <w:lang w:val="en-US" w:eastAsia="ru-RU"/>
-        </w:rPr>
-      </w:pPr>
-      <w:r>
-        <w:rPr>
-          <w:rFonts w:ascii="Times New Roman" w:eastAsia="Times New Roman" w:hAnsi="Times New Roman" w:cs="Times New Roman"/>
-          <w:sz w:val="28"/>
-          <w:szCs w:val="28"/>
-          <w:lang w:val="en-US" w:eastAsia="ru-RU"/>
-        </w:rPr>
-        <w:t xml:space="preserve">"In applying the theoretical knowledge I gained at the university in practical work, I have had to independently acquire additional </w:t>
-        <w:lastRenderedPageBreak/>
-        <w:t xml:space="preserve">knowledge in certain technologies. For this reason, I consider it beneficial to increase the share of modern technologies, software tools, and real project work in the curricula."</w:t>
+        <w:t>BITIRUVCHI NUTQI:</w:t>
+      </w:r>
+    </w:p>
+    <w:p>
+      <w:pPr>
+        <w:spacing w:after="0" w:line="360" w:lineRule="auto"/>
+        <w:ind w:firstLine="567"/>
+        <w:jc w:val="both"/>
+        <w:rPr>
+          <w:rFonts w:ascii="Times New Roman" w:eastAsia="Times New Roman" w:hAnsi="Times New Roman" w:cs="Times New Roman"/>
+          <w:sz w:val="28"/>
+          <w:szCs w:val="28"/>
+          <w:lang w:val="en-US" w:eastAsia="ru-RU"/>
+        </w:rPr>
+      </w:pPr>
+      <w:r>
+        <w:rPr>
+          <w:rFonts w:ascii="Times New Roman" w:eastAsia="Times New Roman" w:hAnsi="Times New Roman" w:cs="Times New Roman"/>
+          <w:sz w:val="28"/>
+          <w:szCs w:val="28"/>
+          <w:lang w:val="en-US" w:eastAsia="ru-RU"/>
+        </w:rPr>
+        <w:t>"Universitetda olgan nazariy bilimlarimni amaliy ishda qo'llashda, ba'zi texnologiyalar bo'yicha qo'shimcha bilimlarni mustaqil o'zlashtirishga to'g'ri keldi. Shu sababli, o'quv rejalarida zamonaviy texnologiyalar, dasturiy vositalar va real loyiha ishlari ulushini oshirishni foydali deb hisoblayman."</w:t>
       </w:r>
     </w:p>
     <w:p>
@@ -2006,29 +1951,29 @@
           <w:szCs w:val="28"/>
           <w:lang w:val="en-US" w:eastAsia="ru-RU"/>
         </w:rPr>
-        <w:t>SPEECH OF THE STUDENT:</w:t>
-      </w:r>
-    </w:p>
-    <w:p>
-      <w:pPr>
-        <w:spacing w:after="0" w:line="360" w:lineRule="auto"/>
-        <w:ind w:firstLine="567"/>
-        <w:jc w:val="both"/>
-        <w:rPr>
-          <w:rFonts w:ascii="Times New Roman" w:eastAsia="Times New Roman" w:hAnsi="Times New Roman" w:cs="Times New Roman"/>
-          <w:sz w:val="28"/>
-          <w:szCs w:val="28"/>
-          <w:lang w:val="en-US" w:eastAsia="ru-RU"/>
-        </w:rPr>
-      </w:pPr>
-      <w:r>
-        <w:rPr>
-          <w:rFonts w:ascii="Times New Roman" w:eastAsia="Times New Roman" w:hAnsi="Times New Roman" w:cs="Times New Roman"/>
-          <w:sz w:val="28"/>
-          <w:szCs w:val="28"/>
-          <w:lang w:val="en-US" w:eastAsia="ru-RU"/>
-        </w:rPr>
-        <w:t xml:space="preserve">"Students should have the opportunity to express their views in the process of improving curricula. If student opinions are taken into account in shaping the content of elective courses and practical classes, interest in the courses will increase."</w:t>
+        <w:t>TALABA NUTQI:</w:t>
+      </w:r>
+    </w:p>
+    <w:p>
+      <w:pPr>
+        <w:spacing w:after="0" w:line="360" w:lineRule="auto"/>
+        <w:ind w:firstLine="567"/>
+        <w:jc w:val="both"/>
+        <w:rPr>
+          <w:rFonts w:ascii="Times New Roman" w:eastAsia="Times New Roman" w:hAnsi="Times New Roman" w:cs="Times New Roman"/>
+          <w:sz w:val="28"/>
+          <w:szCs w:val="28"/>
+          <w:lang w:val="en-US" w:eastAsia="ru-RU"/>
+        </w:rPr>
+      </w:pPr>
+      <w:r>
+        <w:rPr>
+          <w:rFonts w:ascii="Times New Roman" w:eastAsia="Times New Roman" w:hAnsi="Times New Roman" w:cs="Times New Roman"/>
+          <w:sz w:val="28"/>
+          <w:szCs w:val="28"/>
+          <w:lang w:val="en-US" w:eastAsia="ru-RU"/>
+        </w:rPr>
+        <w:t>"Talabalar o'quv rejalarini takomillashtirish jarayonida o'z fikrlarini bildirish imkoniyatiga ega bo'lishi kerak. Agar tanlov fanlari va amaliy mashg'ulotlar mazmunini shakllantirishda talabalar fikri hisobga olinsa, fanlarga qiziqish ortadi."</w:t>
       </w:r>
     </w:p>
     <w:p>
@@ -2055,49 +2000,47 @@
           <w:szCs w:val="28"/>
           <w:lang w:val="en-US" w:eastAsia="ru-RU"/>
         </w:rPr>
-        <w:t>DISCUSSED:</w:t>
-      </w:r>
-    </w:p>
-    <w:p>
-      <w:pPr>
-        <w:spacing w:after="0" w:line="360" w:lineRule="auto"/>
-        <w:ind w:firstLine="567"/>
-        <w:jc w:val="both"/>
-        <w:rPr>
-          <w:rFonts w:ascii="Times New Roman" w:eastAsia="Times New Roman" w:hAnsi="Times New Roman" w:cs="Times New Roman"/>
-          <w:sz w:val="28"/>
-          <w:szCs w:val="28"/>
-          <w:lang w:val="en-US" w:eastAsia="ru-RU"/>
-        </w:rPr>
-      </w:pPr>
-      <w:r>
-        <w:rPr>
-          <w:rFonts w:ascii="Times New Roman" w:eastAsia="Times New Roman" w:hAnsi="Times New Roman" w:cs="Times New Roman"/>
-          <w:sz w:val="28"/>
-          <w:szCs w:val="28"/>
-          <w:lang w:val="en-US" w:eastAsia="ru-RU"/>
-        </w:rPr>
-        <w:t xml:space="preserve">Council members emphasized that work with stakeholder feedback should not be limited to its collection, but should follow the principle of </w:t>
-      </w:r>
-      <w:r>
-        <w:rPr>
-          <w:rFonts w:ascii="Times New Roman" w:eastAsia="Times New Roman" w:hAnsi="Times New Roman" w:cs="Times New Roman"/>
-          <w:b/>
-          <w:bCs/>
-          <w:sz w:val="28"/>
-          <w:szCs w:val="28"/>
-          <w:lang w:val="en-US" w:eastAsia="ru-RU"/>
-        </w:rPr>
-        <w:t xml:space="preserve">analysis → decision-making → implementation → outcome monitoring</w:t>
-      </w:r>
-      <w:r>
-        <w:rPr>
-          <w:rFonts w:ascii="Times New Roman" w:eastAsia="Times New Roman" w:hAnsi="Times New Roman" w:cs="Times New Roman"/>
-          <w:sz w:val="28"/>
-          <w:szCs w:val="28"/>
-          <w:lang w:val="en-US" w:eastAsia="ru-RU"/>
-        </w:rPr>
-        <w:t xml:space="preserve">.</w:t>
+        <w:t>MUHOKAMA QILINDI:</w:t>
+      </w:r>
+    </w:p>
+    <w:p>
+      <w:pPr>
+        <w:spacing w:after="0" w:line="360" w:lineRule="auto"/>
+        <w:ind w:firstLine="567"/>
+        <w:jc w:val="both"/>
+        <w:rPr>
+          <w:rFonts w:ascii="Times New Roman" w:eastAsia="Times New Roman" w:hAnsi="Times New Roman" w:cs="Times New Roman"/>
+          <w:sz w:val="28"/>
+          <w:szCs w:val="28"/>
+          <w:lang w:val="en-US" w:eastAsia="ru-RU"/>
+        </w:rPr>
+      </w:pPr>
+      <w:r>
+        <w:rPr>
+          <w:rFonts w:ascii="Times New Roman" w:eastAsia="Times New Roman" w:hAnsi="Times New Roman" w:cs="Times New Roman"/>
+          <w:sz w:val="28"/>
+          <w:szCs w:val="28"/>
+          <w:lang w:val="en-US" w:eastAsia="ru-RU"/>
+        </w:rPr>
+        <w:t>Kengash a'zolari manfaatdor tomonlar fikr-mulohazalari bilan ishlash faqat ularni to'plash bilan cheklanmasligi, balki tahlil → qaror qabul qilish → amalga oshirish → natijani monitoring qilish tamoyiliga amal qilishi kerakligini ta'kidladi.</w:t>
+      </w:r>
+      <w:r>
+        <w:rPr>
+          <w:rFonts w:ascii="Times New Roman" w:eastAsia="Times New Roman" w:hAnsi="Times New Roman" w:cs="Times New Roman"/>
+          <w:b/>
+          <w:bCs/>
+          <w:sz w:val="28"/>
+          <w:szCs w:val="28"/>
+          <w:lang w:val="en-US" w:eastAsia="ru-RU"/>
+        </w:rPr>
+      </w:r>
+      <w:r>
+        <w:rPr>
+          <w:rFonts w:ascii="Times New Roman" w:eastAsia="Times New Roman" w:hAnsi="Times New Roman" w:cs="Times New Roman"/>
+          <w:sz w:val="28"/>
+          <w:szCs w:val="28"/>
+          <w:lang w:val="en-US" w:eastAsia="ru-RU"/>
+        </w:rPr>
       </w:r>
     </w:p>
     <w:p>
@@ -2124,7 +2067,7 @@
           <w:szCs w:val="28"/>
           <w:lang w:eastAsia="ru-RU"/>
         </w:rPr>
-        <w:t>RESOLVED:</w:t>
+        <w:t>QAROR QILINDI:</w:t>
       </w:r>
     </w:p>
     <w:p>
@@ -2150,7 +2093,7 @@
           <w:szCs w:val="28"/>
           <w:lang w:val="en-US" w:eastAsia="ru-RU"/>
         </w:rPr>
-        <w:t xml:space="preserve">The proposals of students, graduates, and employers shall be consolidated into an analytical reference document.</w:t>
+        <w:t>Talabalar, bitiruvchilar va ish beruvchilarning takliflari tahliliy ma'lumotnomaga jamlashtirilsin.</w:t>
       </w:r>
     </w:p>
     <w:p>
@@ -2176,7 +2119,7 @@
           <w:szCs w:val="28"/>
           <w:lang w:val="en-US" w:eastAsia="ru-RU"/>
         </w:rPr>
-        <w:t xml:space="preserve">Labor market requirements and stakeholder proposals shall be taken into account in improving curricula.</w:t>
+        <w:t>Mehnat bozori talablari va manfaatdor tomonlar takliflari o'quv rejalarini takomillashtirishda hisobga olinsin.</w:t>
       </w:r>
     </w:p>
     <w:p>
@@ -2202,7 +2145,7 @@
           <w:szCs w:val="28"/>
           <w:lang w:val="en-US" w:eastAsia="ru-RU"/>
         </w:rPr>
-        <w:t xml:space="preserve">The share of real projects in practical classes and production internships shall be increased.</w:t>
+        <w:t>Amaliy mashg'ulotlar va ishlab chiqarish amaliyotida real loyihalar ulushi oshirilsin.</w:t>
       </w:r>
     </w:p>
     <w:p>
@@ -2228,7 +2171,7 @@
           <w:szCs w:val="28"/>
           <w:lang w:val="en-US" w:eastAsia="ru-RU"/>
         </w:rPr>
-        <w:t xml:space="preserve">Monitoring in the form of "proposal — measure taken — outcome" shall be maintained for each significant proposal.</w:t>
+        <w:t>Har bir muhim taklif uchun "taklif — ko'rilgan chora — natija" shaklida monitoring yuritilsin.</w:t>
       </w:r>
     </w:p>
     <w:p>
@@ -2254,8 +2197,9 @@
           <w:szCs w:val="28"/>
           <w:lang w:val="en-US" w:eastAsia="ru-RU"/>
         </w:rPr>
-        <w:t xml:space="preserve">Responsible: heads of departments, the Dean of the Faculty, quality assurance officers.</w:t>
+        <w:t>Mas'ullar: kafedra mudirlari, fakultet dekani, sifat ta'minlash xodimlari.</w:t>
         <w:br/>
+        <w:t>Muddat: 2026/2027 o'quv yili davomida.</w:t>
       </w:r>
       <w:r>
         <w:rPr>
@@ -2266,7 +2210,6 @@
           <w:szCs w:val="28"/>
           <w:lang w:eastAsia="ru-RU"/>
         </w:rPr>
-        <w:t>Deadline:</w:t>
       </w:r>
       <w:r>
         <w:rPr>
@@ -2275,7 +2218,6 @@
           <w:szCs w:val="28"/>
           <w:lang w:eastAsia="ru-RU"/>
         </w:rPr>
-        <w:t xml:space="preserve"> during the 2026/2027 academic year.</w:t>
       </w:r>
     </w:p>
     <w:p>
@@ -2302,7 +2244,7 @@
           <w:szCs w:val="28"/>
           <w:lang w:val="en-US" w:eastAsia="ru-RU"/>
         </w:rPr>
-        <w:t>HEARD:</w:t>
+        <w:t>TINGLANDI:</w:t>
       </w:r>
     </w:p>
     <w:p>
@@ -2325,51 +2267,51 @@
           <w:szCs w:val="28"/>
           <w:lang w:val="en-US" w:eastAsia="ru-RU"/>
         </w:rPr>
-        <w:t xml:space="preserve">On the fifth item of the agenda</w:t>
-      </w:r>
-    </w:p>
-    <w:p>
-      <w:pPr>
-        <w:spacing w:after="0" w:line="360" w:lineRule="auto"/>
-        <w:ind w:firstLine="567"/>
-        <w:jc w:val="both"/>
-        <w:rPr>
-          <w:rFonts w:ascii="Times New Roman" w:eastAsia="Times New Roman" w:hAnsi="Times New Roman" w:cs="Times New Roman"/>
-          <w:sz w:val="28"/>
-          <w:szCs w:val="28"/>
-          <w:lang w:val="en-US" w:eastAsia="ru-RU"/>
-        </w:rPr>
-      </w:pPr>
-      <w:r>
-        <w:rPr>
-          <w:rFonts w:ascii="Times New Roman" w:eastAsia="Times New Roman" w:hAnsi="Times New Roman" w:cs="Times New Roman"/>
-          <w:sz w:val="28"/>
-          <w:szCs w:val="28"/>
-          <w:lang w:val="en-US" w:eastAsia="ru-RU"/>
-        </w:rPr>
-        <w:t xml:space="preserve">Heads of departments presented information on the formation of elective courses during the 2025/2026 academic year, students' course selection, the formation of the course catalog, and the results of the selection process.</w:t>
-      </w:r>
-    </w:p>
-    <w:p>
-      <w:pPr>
-        <w:spacing w:after="0" w:line="360" w:lineRule="auto"/>
-        <w:ind w:firstLine="567"/>
-        <w:jc w:val="both"/>
-        <w:rPr>
-          <w:rFonts w:ascii="Times New Roman" w:eastAsia="Times New Roman" w:hAnsi="Times New Roman" w:cs="Times New Roman"/>
-          <w:sz w:val="28"/>
-          <w:szCs w:val="28"/>
-          <w:lang w:val="en-US" w:eastAsia="ru-RU"/>
-        </w:rPr>
-      </w:pPr>
-      <w:r>
-        <w:rPr>
-          <w:rFonts w:ascii="Times New Roman" w:eastAsia="Times New Roman" w:hAnsi="Times New Roman" w:cs="Times New Roman"/>
-          <w:sz w:val="28"/>
-          <w:szCs w:val="28"/>
-          <w:lang w:val="en-US" w:eastAsia="ru-RU"/>
-        </w:rPr>
-        <w:t xml:space="preserve">The alignment of the content of elective courses with the objectives of the educational program, Learning Outcomes, and professional competencies was discussed.</w:t>
+        <w:t>Kun tartibining beshinchi masalasi bo'yicha</w:t>
+      </w:r>
+    </w:p>
+    <w:p>
+      <w:pPr>
+        <w:spacing w:after="0" w:line="360" w:lineRule="auto"/>
+        <w:ind w:firstLine="567"/>
+        <w:jc w:val="both"/>
+        <w:rPr>
+          <w:rFonts w:ascii="Times New Roman" w:eastAsia="Times New Roman" w:hAnsi="Times New Roman" w:cs="Times New Roman"/>
+          <w:sz w:val="28"/>
+          <w:szCs w:val="28"/>
+          <w:lang w:val="en-US" w:eastAsia="ru-RU"/>
+        </w:rPr>
+      </w:pPr>
+      <w:r>
+        <w:rPr>
+          <w:rFonts w:ascii="Times New Roman" w:eastAsia="Times New Roman" w:hAnsi="Times New Roman" w:cs="Times New Roman"/>
+          <w:sz w:val="28"/>
+          <w:szCs w:val="28"/>
+          <w:lang w:val="en-US" w:eastAsia="ru-RU"/>
+        </w:rPr>
+        <w:t>Kafedra mudirlari 2025/2026 o'quv yilida tanlov fanlarining shakllantirilishi, talabalarning fan tanlashi, fan katalogining shakllantirilishi va tanlash jarayoni natijalari haqida ma'lumot taqdim etdi.</w:t>
+      </w:r>
+    </w:p>
+    <w:p>
+      <w:pPr>
+        <w:spacing w:after="0" w:line="360" w:lineRule="auto"/>
+        <w:ind w:firstLine="567"/>
+        <w:jc w:val="both"/>
+        <w:rPr>
+          <w:rFonts w:ascii="Times New Roman" w:eastAsia="Times New Roman" w:hAnsi="Times New Roman" w:cs="Times New Roman"/>
+          <w:sz w:val="28"/>
+          <w:szCs w:val="28"/>
+          <w:lang w:val="en-US" w:eastAsia="ru-RU"/>
+        </w:rPr>
+      </w:pPr>
+      <w:r>
+        <w:rPr>
+          <w:rFonts w:ascii="Times New Roman" w:eastAsia="Times New Roman" w:hAnsi="Times New Roman" w:cs="Times New Roman"/>
+          <w:sz w:val="28"/>
+          <w:szCs w:val="28"/>
+          <w:lang w:val="en-US" w:eastAsia="ru-RU"/>
+        </w:rPr>
+        <w:t>Tanlov fanlari mazmunining ta'lim dasturi maqsadlari, o'quv natijalari va kasbiy kompetensiyalarga muvofiqligini muhokama qilindi.</w:t>
       </w:r>
     </w:p>
     <w:p>
@@ -2396,30 +2338,29 @@
           <w:szCs w:val="28"/>
           <w:lang w:val="en-US" w:eastAsia="ru-RU"/>
         </w:rPr>
-        <w:lastRenderedPageBreak/>
-        <w:t>SPEECH OF THE EMPLOYER:</w:t>
-      </w:r>
-    </w:p>
-    <w:p>
-      <w:pPr>
-        <w:spacing w:after="0" w:line="360" w:lineRule="auto"/>
-        <w:ind w:firstLine="567"/>
-        <w:jc w:val="both"/>
-        <w:rPr>
-          <w:rFonts w:ascii="Times New Roman" w:eastAsia="Times New Roman" w:hAnsi="Times New Roman" w:cs="Times New Roman"/>
-          <w:sz w:val="28"/>
-          <w:szCs w:val="28"/>
-          <w:lang w:val="en-US" w:eastAsia="ru-RU"/>
-        </w:rPr>
-      </w:pPr>
-      <w:r>
-        <w:rPr>
-          <w:rFonts w:ascii="Times New Roman" w:eastAsia="Times New Roman" w:hAnsi="Times New Roman" w:cs="Times New Roman"/>
-          <w:sz w:val="28"/>
-          <w:szCs w:val="28"/>
-          <w:lang w:val="en-US" w:eastAsia="ru-RU"/>
-        </w:rPr>
-        <w:t xml:space="preserve">"Elective courses should be formed in line with modern labor market requirements. For example, there is a need for practice-oriented courses in areas such as artificial intelligence, data analytics, cloud technologies, cybersecurity, and mobile and web development."</w:t>
+        <w:t>ISH BERUVCHI NUTQI:</w:t>
+      </w:r>
+    </w:p>
+    <w:p>
+      <w:pPr>
+        <w:spacing w:after="0" w:line="360" w:lineRule="auto"/>
+        <w:ind w:firstLine="567"/>
+        <w:jc w:val="both"/>
+        <w:rPr>
+          <w:rFonts w:ascii="Times New Roman" w:eastAsia="Times New Roman" w:hAnsi="Times New Roman" w:cs="Times New Roman"/>
+          <w:sz w:val="28"/>
+          <w:szCs w:val="28"/>
+          <w:lang w:val="en-US" w:eastAsia="ru-RU"/>
+        </w:rPr>
+      </w:pPr>
+      <w:r>
+        <w:rPr>
+          <w:rFonts w:ascii="Times New Roman" w:eastAsia="Times New Roman" w:hAnsi="Times New Roman" w:cs="Times New Roman"/>
+          <w:sz w:val="28"/>
+          <w:szCs w:val="28"/>
+          <w:lang w:val="en-US" w:eastAsia="ru-RU"/>
+        </w:rPr>
+        <w:t>"Tanlov fanlari zamonaviy mehnat bozori talablariga muvofiq shakllantirilishi kerak. Masalan, sun'iy intellekt, ma'lumotlar tahlili, bulutli texnologiyalar, kiberxavfsizlik, mobil va veb-dasturlash kabi sohalarda amaliyotga yo'naltirilgan fanlarga ehtiyoj bor."</w:t>
       </w:r>
     </w:p>
     <w:p>
@@ -2446,29 +2387,29 @@
           <w:szCs w:val="28"/>
           <w:lang w:val="en-US" w:eastAsia="ru-RU"/>
         </w:rPr>
-        <w:t>SPEECH OF THE STUDENT:</w:t>
-      </w:r>
-    </w:p>
-    <w:p>
-      <w:pPr>
-        <w:spacing w:after="0" w:line="360" w:lineRule="auto"/>
-        <w:ind w:firstLine="567"/>
-        <w:jc w:val="both"/>
-        <w:rPr>
-          <w:rFonts w:ascii="Times New Roman" w:eastAsia="Times New Roman" w:hAnsi="Times New Roman" w:cs="Times New Roman"/>
-          <w:sz w:val="28"/>
-          <w:szCs w:val="28"/>
-          <w:lang w:val="en-US" w:eastAsia="ru-RU"/>
-        </w:rPr>
-      </w:pPr>
-      <w:r>
-        <w:rPr>
-          <w:rFonts w:ascii="Times New Roman" w:eastAsia="Times New Roman" w:hAnsi="Times New Roman" w:cs="Times New Roman"/>
-          <w:sz w:val="28"/>
-          <w:szCs w:val="28"/>
-          <w:lang w:val="en-US" w:eastAsia="ru-RU"/>
-        </w:rPr>
-        <w:t xml:space="preserve">"It is important that students be given detailed information about a course before selecting it. If the course content, credit value, technologies to be studied, mode of instruction, and the skills to be acquired upon completion are indicated in advance, students will make an informed choice."</w:t>
+        <w:t>TALABA NUTQI:</w:t>
+      </w:r>
+    </w:p>
+    <w:p>
+      <w:pPr>
+        <w:spacing w:after="0" w:line="360" w:lineRule="auto"/>
+        <w:ind w:firstLine="567"/>
+        <w:jc w:val="both"/>
+        <w:rPr>
+          <w:rFonts w:ascii="Times New Roman" w:eastAsia="Times New Roman" w:hAnsi="Times New Roman" w:cs="Times New Roman"/>
+          <w:sz w:val="28"/>
+          <w:szCs w:val="28"/>
+          <w:lang w:val="en-US" w:eastAsia="ru-RU"/>
+        </w:rPr>
+      </w:pPr>
+      <w:r>
+        <w:rPr>
+          <w:rFonts w:ascii="Times New Roman" w:eastAsia="Times New Roman" w:hAnsi="Times New Roman" w:cs="Times New Roman"/>
+          <w:sz w:val="28"/>
+          <w:szCs w:val="28"/>
+          <w:lang w:val="en-US" w:eastAsia="ru-RU"/>
+        </w:rPr>
+        <w:t>"Talabalarga fanni tanlashdan oldin u haqida batafsil ma'lumot berilishi muhimdir. Agar fan mazmuni, kredit qiymati, o'rganiladigan texnologiyalar, o'qitish shakli va tugatgandan keyin erishiladigan ko'nikmalar oldindan ko'rsatilsa, talabalar ongli tanlov qiladi."</w:t>
       </w:r>
     </w:p>
     <w:p>
@@ -2495,29 +2436,29 @@
           <w:szCs w:val="28"/>
           <w:lang w:val="en-US" w:eastAsia="ru-RU"/>
         </w:rPr>
-        <w:t>SPEECH OF THE GRADUATE:</w:t>
-      </w:r>
-    </w:p>
-    <w:p>
-      <w:pPr>
-        <w:spacing w:after="0" w:line="360" w:lineRule="auto"/>
-        <w:ind w:firstLine="567"/>
-        <w:jc w:val="both"/>
-        <w:rPr>
-          <w:rFonts w:ascii="Times New Roman" w:eastAsia="Times New Roman" w:hAnsi="Times New Roman" w:cs="Times New Roman"/>
-          <w:sz w:val="28"/>
-          <w:szCs w:val="28"/>
-          <w:lang w:val="en-US" w:eastAsia="ru-RU"/>
-        </w:rPr>
-      </w:pPr>
-      <w:r>
-        <w:rPr>
-          <w:rFonts w:ascii="Times New Roman" w:eastAsia="Times New Roman" w:hAnsi="Times New Roman" w:cs="Times New Roman"/>
-          <w:sz w:val="28"/>
-          <w:szCs w:val="28"/>
-          <w:lang w:val="en-US" w:eastAsia="ru-RU"/>
-        </w:rPr>
-        <w:t xml:space="preserve">"The opportunity to select elective courses is important in determining a graduate's future professional path. For this reason, courses should not duplicate one another and should cover a range of professional directions."</w:t>
+        <w:t>BITIRUVCHI NUTQI:</w:t>
+      </w:r>
+    </w:p>
+    <w:p>
+      <w:pPr>
+        <w:spacing w:after="0" w:line="360" w:lineRule="auto"/>
+        <w:ind w:firstLine="567"/>
+        <w:jc w:val="both"/>
+        <w:rPr>
+          <w:rFonts w:ascii="Times New Roman" w:eastAsia="Times New Roman" w:hAnsi="Times New Roman" w:cs="Times New Roman"/>
+          <w:sz w:val="28"/>
+          <w:szCs w:val="28"/>
+          <w:lang w:val="en-US" w:eastAsia="ru-RU"/>
+        </w:rPr>
+      </w:pPr>
+      <w:r>
+        <w:rPr>
+          <w:rFonts w:ascii="Times New Roman" w:eastAsia="Times New Roman" w:hAnsi="Times New Roman" w:cs="Times New Roman"/>
+          <w:sz w:val="28"/>
+          <w:szCs w:val="28"/>
+          <w:lang w:val="en-US" w:eastAsia="ru-RU"/>
+        </w:rPr>
+        <w:t>"Tanlov fanlarini tanlash imkoniyati bitiruvchining kelajakdagi kasbiy yo'lini belgilashda muhim ahamiyatga ega. Shu sababli, fanlar bir-birini takrorlamasligi va turli kasbiy yo'nalishlarni qamrab olishi kerak."</w:t>
       </w:r>
     </w:p>
     <w:p>
@@ -2544,29 +2485,29 @@
           <w:szCs w:val="28"/>
           <w:lang w:val="en-US" w:eastAsia="ru-RU"/>
         </w:rPr>
-        <w:t>DISCUSSED:</w:t>
-      </w:r>
-    </w:p>
-    <w:p>
-      <w:pPr>
-        <w:spacing w:after="0" w:line="360" w:lineRule="auto"/>
-        <w:ind w:firstLine="567"/>
-        <w:jc w:val="both"/>
-        <w:rPr>
-          <w:rFonts w:ascii="Times New Roman" w:eastAsia="Times New Roman" w:hAnsi="Times New Roman" w:cs="Times New Roman"/>
-          <w:sz w:val="28"/>
-          <w:szCs w:val="28"/>
-          <w:lang w:val="en-US" w:eastAsia="ru-RU"/>
-        </w:rPr>
-      </w:pPr>
-      <w:r>
-        <w:rPr>
-          <w:rFonts w:ascii="Times New Roman" w:eastAsia="Times New Roman" w:hAnsi="Times New Roman" w:cs="Times New Roman"/>
-          <w:sz w:val="28"/>
-          <w:szCs w:val="28"/>
-          <w:lang w:val="en-US" w:eastAsia="ru-RU"/>
-        </w:rPr>
-        <w:t xml:space="preserve">The need to regularly update the elective course catalog, study student opinions, take into account employer proposals, and ensure the alignment of courses with the intended learning outcomes of educational programs was noted.</w:t>
+        <w:t>MUHOKAMA QILINDI:</w:t>
+      </w:r>
+    </w:p>
+    <w:p>
+      <w:pPr>
+        <w:spacing w:after="0" w:line="360" w:lineRule="auto"/>
+        <w:ind w:firstLine="567"/>
+        <w:jc w:val="both"/>
+        <w:rPr>
+          <w:rFonts w:ascii="Times New Roman" w:eastAsia="Times New Roman" w:hAnsi="Times New Roman" w:cs="Times New Roman"/>
+          <w:sz w:val="28"/>
+          <w:szCs w:val="28"/>
+          <w:lang w:val="en-US" w:eastAsia="ru-RU"/>
+        </w:rPr>
+      </w:pPr>
+      <w:r>
+        <w:rPr>
+          <w:rFonts w:ascii="Times New Roman" w:eastAsia="Times New Roman" w:hAnsi="Times New Roman" w:cs="Times New Roman"/>
+          <w:sz w:val="28"/>
+          <w:szCs w:val="28"/>
+          <w:lang w:val="en-US" w:eastAsia="ru-RU"/>
+        </w:rPr>
+        <w:t>Tanlov fanlari katalogini muntazam yangilab turish, talabalar fikrini o'rganish, ish beruvchilar takliflarini hisobga olish va fanlarning ta'lim dasturlarining rejalashtirilgan o'quv natijalariga muvofiqligini ta'minlash zarurligi ta'kidlandi.</w:t>
       </w:r>
     </w:p>
     <w:p>
@@ -2593,7 +2534,7 @@
           <w:szCs w:val="28"/>
           <w:lang w:eastAsia="ru-RU"/>
         </w:rPr>
-        <w:t>RESOLVED:</w:t>
+        <w:t>QAROR QILINDI:</w:t>
       </w:r>
     </w:p>
     <w:p>
@@ -2619,7 +2560,7 @@
           <w:szCs w:val="28"/>
           <w:lang w:eastAsia="ru-RU"/>
         </w:rPr>
-        <w:t xml:space="preserve">The elective course catalog shall be reviewed and updated, as necessary, at the end of each academic year.</w:t>
+        <w:t>Tanlov fanlari katalogi har o'quv yili oxirida ko'rib chiqilsin va zarur hollarda yangilansin.</w:t>
       </w:r>
     </w:p>
     <w:p>
@@ -2645,7 +2586,7 @@
           <w:szCs w:val="28"/>
           <w:lang w:val="en-US" w:eastAsia="ru-RU"/>
         </w:rPr>
-        <w:t xml:space="preserve">Students shall be provided with complete information on elective courses, including course content, credit value, Learning Outcomes, prerequisites, and the competencies to be developed.</w:t>
+        <w:t>Talabalarga tanlov fanlari haqida to'liq ma'lumot, jumladan fan mazmuni, kredit qiymati, o'quv natijalari, zaruriy oldingi fanlar va rivojlantiriladigan kompetensiyalar to'g'risida ma'lumot berilsin.</w:t>
       </w:r>
     </w:p>
     <w:p>
@@ -2671,7 +2612,7 @@
           <w:szCs w:val="28"/>
           <w:lang w:val="en-US" w:eastAsia="ru-RU"/>
         </w:rPr>
-        <w:t xml:space="preserve">Opportunities for introducing new, modern elective courses shall be explored on the basis of the proposals of employers and graduates.</w:t>
+        <w:t>Ish beruvchilar va bitiruvchilar takliflari asosida yangi, zamonaviy tanlov fanlarini joriy etish imkoniyatlari o'rganilsin.</w:t>
       </w:r>
     </w:p>
     <w:p>
@@ -2697,7 +2638,7 @@
           <w:szCs w:val="28"/>
           <w:lang w:val="en-US" w:eastAsia="ru-RU"/>
         </w:rPr>
-        <w:t xml:space="preserve">The process of student selection of elective courses shall be organized in a transparent manner and on the basis of equal opportunity.</w:t>
+        <w:t>Talabalarning tanlov fanlarini tanlash jarayoni shaffof va teng imkoniyat asosida tashkil etilsin.</w:t>
       </w:r>
     </w:p>
     <w:p>
@@ -2723,28 +2664,27 @@
           <w:szCs w:val="28"/>
           <w:lang w:val="en-US" w:eastAsia="ru-RU"/>
         </w:rPr>
-        <w:t xml:space="preserve">Responsible: heads of departments.</w:t>
+        <w:t>Mas'ullar: kafedra mudirlari.</w:t>
         <w:br/>
-      </w:r>
-      <w:r>
-        <w:rPr>
-          <w:rFonts w:ascii="Times New Roman" w:eastAsia="Times New Roman" w:hAnsi="Times New Roman" w:cs="Times New Roman"/>
-          <w:b/>
-          <w:bCs/>
-          <w:sz w:val="28"/>
-          <w:szCs w:val="28"/>
-          <w:lang w:val="en-US" w:eastAsia="ru-RU"/>
-        </w:rPr>
-        <w:t>Deadline:</w:t>
-      </w:r>
-      <w:r>
-        <w:rPr>
-          <w:rFonts w:ascii="Times New Roman" w:eastAsia="Times New Roman" w:hAnsi="Times New Roman" w:cs="Times New Roman"/>
-          <w:sz w:val="28"/>
-          <w:szCs w:val="28"/>
-          <w:lang w:val="en-US" w:eastAsia="ru-RU"/>
-        </w:rPr>
-        <w:t xml:space="preserve"> before the start of the 2026/2027 academic year.</w:t>
+        <w:t>Muddat: 2026/2027 o'quv yili boshlanishidan oldin.</w:t>
+      </w:r>
+      <w:r>
+        <w:rPr>
+          <w:rFonts w:ascii="Times New Roman" w:eastAsia="Times New Roman" w:hAnsi="Times New Roman" w:cs="Times New Roman"/>
+          <w:b/>
+          <w:bCs/>
+          <w:sz w:val="28"/>
+          <w:szCs w:val="28"/>
+          <w:lang w:val="en-US" w:eastAsia="ru-RU"/>
+        </w:rPr>
+      </w:r>
+      <w:r>
+        <w:rPr>
+          <w:rFonts w:ascii="Times New Roman" w:eastAsia="Times New Roman" w:hAnsi="Times New Roman" w:cs="Times New Roman"/>
+          <w:sz w:val="28"/>
+          <w:szCs w:val="28"/>
+          <w:lang w:val="en-US" w:eastAsia="ru-RU"/>
+        </w:rPr>
       </w:r>
     </w:p>
     <w:p>
@@ -2773,72 +2713,69 @@
           <w:szCs w:val="28"/>
           <w:lang w:val="en-US" w:eastAsia="ru-RU"/>
         </w:rPr>
-        <w:lastRenderedPageBreak/>
-        <w:t>FINAL DISCUSSION</w:t>
-      </w:r>
-    </w:p>
-    <w:p>
-      <w:pPr>
-        <w:spacing w:after="0" w:line="360" w:lineRule="auto"/>
-        <w:ind w:firstLine="567"/>
-        <w:jc w:val="both"/>
-        <w:rPr>
-          <w:rFonts w:ascii="Times New Roman" w:eastAsia="Times New Roman" w:hAnsi="Times New Roman" w:cs="Times New Roman"/>
-          <w:sz w:val="28"/>
-          <w:szCs w:val="28"/>
-          <w:lang w:val="en-US" w:eastAsia="ru-RU"/>
-        </w:rPr>
-      </w:pPr>
-      <w:r>
-        <w:rPr>
-          <w:rFonts w:ascii="Times New Roman" w:eastAsia="Times New Roman" w:hAnsi="Times New Roman" w:cs="Times New Roman"/>
-          <w:sz w:val="28"/>
-          <w:szCs w:val="28"/>
-          <w:lang w:val="en-US" w:eastAsia="ru-RU"/>
-        </w:rPr>
-        <w:t xml:space="preserve">Chairperson of the Faculty Council </w:t>
-      </w:r>
-      <w:r>
-        <w:rPr>
-          <w:rFonts w:ascii="Times New Roman" w:eastAsia="Times New Roman" w:hAnsi="Times New Roman" w:cs="Times New Roman"/>
-          <w:b/>
-          <w:bCs/>
-          <w:sz w:val="28"/>
-          <w:szCs w:val="28"/>
-          <w:lang w:val="en-US" w:eastAsia="ru-RU"/>
-        </w:rPr>
-        <w:t>Djumayev F.T.</w:t>
-      </w:r>
-      <w:r>
-        <w:rPr>
-          <w:rFonts w:ascii="Times New Roman" w:eastAsia="Times New Roman" w:hAnsi="Times New Roman" w:cs="Times New Roman"/>
-          <w:sz w:val="28"/>
-          <w:szCs w:val="28"/>
-          <w:lang w:val="en-US" w:eastAsia="ru-RU"/>
-        </w:rPr>
-        <w:t xml:space="preserve"> took the floor and, in addition to analyzing the work carried out on the results of the 2025/2026 academic year, emphasized the need to address the identified problems in the following academic year, to implement stakeholders' proposals in practice, and to continue improving educational programs in line with labor market requirements.</w:t>
-      </w:r>
-    </w:p>
-    <w:p>
-      <w:pPr>
-        <w:spacing w:after="0" w:line="360" w:lineRule="auto"/>
-        <w:ind w:firstLine="567"/>
-        <w:jc w:val="both"/>
-        <w:rPr>
-          <w:rFonts w:ascii="Times New Roman" w:eastAsia="Times New Roman" w:hAnsi="Times New Roman" w:cs="Times New Roman"/>
-          <w:sz w:val="28"/>
-          <w:szCs w:val="28"/>
-          <w:lang w:val="en-US" w:eastAsia="ru-RU"/>
-        </w:rPr>
-      </w:pPr>
-      <w:r>
-        <w:rPr>
-          <w:rFonts w:ascii="Times New Roman" w:eastAsia="Times New Roman" w:hAnsi="Times New Roman" w:cs="Times New Roman"/>
-          <w:sz w:val="28"/>
-          <w:szCs w:val="28"/>
-          <w:lang w:val="en-US" w:eastAsia="ru-RU"/>
-        </w:rPr>
-        <w:t>It was determined that the proposals put forward by employers, graduates, and students during the meeting shall be taken into account in the faculty's subsequent work on improving educational quality.</w:t>
+        <w:t>YAKUNIY MUHOKAMA</w:t>
+      </w:r>
+    </w:p>
+    <w:p>
+      <w:pPr>
+        <w:spacing w:after="0" w:line="360" w:lineRule="auto"/>
+        <w:ind w:firstLine="567"/>
+        <w:jc w:val="both"/>
+        <w:rPr>
+          <w:rFonts w:ascii="Times New Roman" w:eastAsia="Times New Roman" w:hAnsi="Times New Roman" w:cs="Times New Roman"/>
+          <w:sz w:val="28"/>
+          <w:szCs w:val="28"/>
+          <w:lang w:val="en-US" w:eastAsia="ru-RU"/>
+        </w:rPr>
+      </w:pPr>
+      <w:r>
+        <w:rPr>
+          <w:rFonts w:ascii="Times New Roman" w:eastAsia="Times New Roman" w:hAnsi="Times New Roman" w:cs="Times New Roman"/>
+          <w:sz w:val="28"/>
+          <w:szCs w:val="28"/>
+          <w:lang w:val="en-US" w:eastAsia="ru-RU"/>
+        </w:rPr>
+        <w:t>Fakultet kengashi raisi Djumayev F.T. so'zga chiqib, 2025/2026 o'quv yili natijalari bo'yicha olib borilgan ishlarni tahlil qilish bilan birga, aniqlangan muammolarni kelgusi o'quv yilida bartaraf etish, manfaatdor tomonlar takliflarini amaliyotga joriy etish va ta'lim dasturlarini mehnat bozori talablariga muvofiq takomillashtirishni davom ettirish zarurligini ta'kidladi.</w:t>
+      </w:r>
+      <w:r>
+        <w:rPr>
+          <w:rFonts w:ascii="Times New Roman" w:eastAsia="Times New Roman" w:hAnsi="Times New Roman" w:cs="Times New Roman"/>
+          <w:b/>
+          <w:bCs/>
+          <w:sz w:val="28"/>
+          <w:szCs w:val="28"/>
+          <w:lang w:val="en-US" w:eastAsia="ru-RU"/>
+        </w:rPr>
+      </w:r>
+      <w:r>
+        <w:rPr>
+          <w:rFonts w:ascii="Times New Roman" w:eastAsia="Times New Roman" w:hAnsi="Times New Roman" w:cs="Times New Roman"/>
+          <w:sz w:val="28"/>
+          <w:szCs w:val="28"/>
+          <w:lang w:val="en-US" w:eastAsia="ru-RU"/>
+        </w:rPr>
+      </w:r>
+    </w:p>
+    <w:p>
+      <w:pPr>
+        <w:spacing w:after="0" w:line="360" w:lineRule="auto"/>
+        <w:ind w:firstLine="567"/>
+        <w:jc w:val="both"/>
+        <w:rPr>
+          <w:rFonts w:ascii="Times New Roman" w:eastAsia="Times New Roman" w:hAnsi="Times New Roman" w:cs="Times New Roman"/>
+          <w:sz w:val="28"/>
+          <w:szCs w:val="28"/>
+          <w:lang w:val="en-US" w:eastAsia="ru-RU"/>
+        </w:rPr>
+      </w:pPr>
+      <w:r>
+        <w:rPr>
+          <w:rFonts w:ascii="Times New Roman" w:eastAsia="Times New Roman" w:hAnsi="Times New Roman" w:cs="Times New Roman"/>
+          <w:sz w:val="28"/>
+          <w:szCs w:val="28"/>
+          <w:lang w:val="en-US" w:eastAsia="ru-RU"/>
+        </w:rPr>
+        <w:t>Yig'ilish davomida ish beruvchilar, bitiruvchilar va talabalar tomonidan bildirilgan takliflar fakultetning ta'lim sifatini oshirish bo'yicha keyingi ishlarida hisobga olinishi belgilandi.</w:t>
       </w:r>
     </w:p>
     <w:p>
@@ -2865,150 +2802,146 @@
           <w:szCs w:val="28"/>
           <w:lang w:val="en-US" w:eastAsia="ru-RU"/>
         </w:rPr>
-        <w:t>FINAL RESOLUTION</w:t>
-      </w:r>
-    </w:p>
-    <w:p>
-      <w:pPr>
-        <w:spacing w:after="0" w:line="360" w:lineRule="auto"/>
-        <w:ind w:firstLine="567"/>
-        <w:jc w:val="both"/>
-        <w:rPr>
-          <w:rFonts w:ascii="Times New Roman" w:eastAsia="Times New Roman" w:hAnsi="Times New Roman" w:cs="Times New Roman"/>
-          <w:sz w:val="28"/>
-          <w:szCs w:val="28"/>
-          <w:lang w:val="en-US" w:eastAsia="ru-RU"/>
-        </w:rPr>
-      </w:pPr>
-      <w:r>
-        <w:rPr>
-          <w:rFonts w:ascii="Times New Roman" w:eastAsia="Times New Roman" w:hAnsi="Times New Roman" w:cs="Times New Roman"/>
-          <w:sz w:val="28"/>
-          <w:szCs w:val="28"/>
-          <w:lang w:val="en-US" w:eastAsia="ru-RU"/>
-        </w:rPr>
-        <w:t>Having discussed the work carried out during the 2025/2026 academic year, the Faculty Council deems it appropriate to implement the above-mentioned measures during the 2026/2027 academic year.</w:t>
-      </w:r>
-    </w:p>
-    <w:p>
-      <w:pPr>
-        <w:spacing w:after="0" w:line="360" w:lineRule="auto"/>
-        <w:ind w:firstLine="567"/>
-        <w:jc w:val="both"/>
-        <w:rPr>
-          <w:rFonts w:ascii="Times New Roman" w:eastAsia="Times New Roman" w:hAnsi="Times New Roman" w:cs="Times New Roman"/>
-          <w:sz w:val="28"/>
-          <w:szCs w:val="28"/>
-          <w:lang w:val="en-US" w:eastAsia="ru-RU"/>
-        </w:rPr>
-      </w:pPr>
-      <w:r>
-        <w:rPr>
-          <w:rFonts w:ascii="Times New Roman" w:eastAsia="Times New Roman" w:hAnsi="Times New Roman" w:cs="Times New Roman"/>
-          <w:sz w:val="28"/>
-          <w:szCs w:val="28"/>
-          <w:lang w:val="en-US" w:eastAsia="ru-RU"/>
-        </w:rPr>
-        <w:t xml:space="preserve">Oversight of the implementation of these resolutions shall be entrusted to the Dean of the Faculty, </w:t>
-      </w:r>
-      <w:r>
-        <w:rPr>
-          <w:rFonts w:ascii="Times New Roman" w:eastAsia="Times New Roman" w:hAnsi="Times New Roman" w:cs="Times New Roman"/>
-          <w:b/>
-          <w:bCs/>
-          <w:sz w:val="28"/>
-          <w:szCs w:val="28"/>
-          <w:lang w:val="en-US" w:eastAsia="ru-RU"/>
-        </w:rPr>
-        <w:t>Djumayev F.T.</w:t>
-      </w:r>
-      <w:r>
-        <w:rPr>
-          <w:rFonts w:ascii="Times New Roman" w:eastAsia="Times New Roman" w:hAnsi="Times New Roman" w:cs="Times New Roman"/>
-          <w:sz w:val="28"/>
-          <w:szCs w:val="28"/>
-          <w:lang w:val="en-US" w:eastAsia="ru-RU"/>
-        </w:rPr>
-        <w:t xml:space="preserve">.</w:t>
-      </w:r>
-    </w:p>
-    <w:p>
-      <w:pPr>
-        <w:spacing w:after="0" w:line="360" w:lineRule="auto"/>
-        <w:ind w:firstLine="567"/>
-        <w:jc w:val="both"/>
-        <w:rPr>
-          <w:rFonts w:ascii="Times New Roman" w:eastAsia="Times New Roman" w:hAnsi="Times New Roman" w:cs="Times New Roman"/>
-          <w:sz w:val="28"/>
-          <w:szCs w:val="28"/>
-          <w:lang w:val="en-US" w:eastAsia="ru-RU"/>
-        </w:rPr>
-      </w:pPr>
-    </w:p>
-    <w:p>
-      <w:pPr>
-        <w:spacing w:after="0" w:line="360" w:lineRule="auto"/>
-        <w:ind w:firstLine="567"/>
-        <w:jc w:val="both"/>
-        <w:rPr>
-          <w:rFonts w:ascii="Times New Roman" w:eastAsia="Times New Roman" w:hAnsi="Times New Roman" w:cs="Times New Roman"/>
-          <w:sz w:val="28"/>
-          <w:szCs w:val="28"/>
-          <w:lang w:val="en-US" w:eastAsia="ru-RU"/>
-        </w:rPr>
-      </w:pPr>
-      <w:r>
-        <w:rPr>
-          <w:rFonts w:ascii="Times New Roman" w:eastAsia="Times New Roman" w:hAnsi="Times New Roman" w:cs="Times New Roman"/>
-          <w:b/>
-          <w:bCs/>
-          <w:sz w:val="28"/>
-          <w:szCs w:val="28"/>
-          <w:lang w:val="en-US" w:eastAsia="ru-RU"/>
-        </w:rPr>
-        <w:t xml:space="preserve">Chairperson of the Faculty Council:</w:t>
-      </w:r>
-      <w:r>
-        <w:rPr>
-          <w:rFonts w:ascii="Times New Roman" w:eastAsia="Times New Roman" w:hAnsi="Times New Roman" w:cs="Times New Roman"/>
-          <w:sz w:val="28"/>
-          <w:szCs w:val="28"/>
-          <w:lang w:val="en-US" w:eastAsia="ru-RU"/>
-        </w:rPr>
-        <w:t xml:space="preserve"> _____________ F.T. Djumayev</w:t>
-      </w:r>
-    </w:p>
-    <w:p>
-      <w:pPr>
-        <w:spacing w:after="0" w:line="360" w:lineRule="auto"/>
-        <w:ind w:firstLine="567"/>
-        <w:jc w:val="both"/>
-        <w:rPr>
-          <w:rFonts w:ascii="Times New Roman" w:eastAsia="Times New Roman" w:hAnsi="Times New Roman" w:cs="Times New Roman"/>
-          <w:sz w:val="28"/>
-          <w:szCs w:val="28"/>
-          <w:lang w:val="en-US" w:eastAsia="ru-RU"/>
-        </w:rPr>
-      </w:pPr>
-      <w:r>
-        <w:rPr>
-          <w:rFonts w:ascii="Times New Roman" w:eastAsia="Times New Roman" w:hAnsi="Times New Roman" w:cs="Times New Roman"/>
-          <w:b/>
-          <w:bCs/>
-          <w:sz w:val="28"/>
-          <w:szCs w:val="28"/>
-          <w:lang w:val="en-US" w:eastAsia="ru-RU"/>
-        </w:rPr>
-        <w:t xml:space="preserve">Secretary of the Faculty Council:</w:t>
-      </w:r>
-      <w:r>
-        <w:rPr>
-          <w:rFonts w:ascii="Times New Roman" w:eastAsia="Times New Roman" w:hAnsi="Times New Roman" w:cs="Times New Roman"/>
-          <w:sz w:val="28"/>
-          <w:szCs w:val="28"/>
-          <w:lang w:val="en-US" w:eastAsia="ru-RU"/>
-        </w:rPr>
-        <w:t xml:space="preserve"> _____________ B.P. Abdullayev</w:t>
+        <w:t>YAKUNIY QAROR</w:t>
+      </w:r>
+    </w:p>
+    <w:p>
+      <w:pPr>
+        <w:spacing w:after="0" w:line="360" w:lineRule="auto"/>
+        <w:ind w:firstLine="567"/>
+        <w:jc w:val="both"/>
+        <w:rPr>
+          <w:rFonts w:ascii="Times New Roman" w:eastAsia="Times New Roman" w:hAnsi="Times New Roman" w:cs="Times New Roman"/>
+          <w:sz w:val="28"/>
+          <w:szCs w:val="28"/>
+          <w:lang w:val="en-US" w:eastAsia="ru-RU"/>
+        </w:rPr>
+      </w:pPr>
+      <w:r>
+        <w:rPr>
+          <w:rFonts w:ascii="Times New Roman" w:eastAsia="Times New Roman" w:hAnsi="Times New Roman" w:cs="Times New Roman"/>
+          <w:sz w:val="28"/>
+          <w:szCs w:val="28"/>
+          <w:lang w:val="en-US" w:eastAsia="ru-RU"/>
+        </w:rPr>
+        <w:t>2025/2026 o'quv yilida olib borilgan ishlarni muhokama qilib, Fakultet kengashi yuqorida ko'rsatilgan chora-tadbirlarni 2026/2027 o'quv yilida amalga oshirishni maqsadga muvofiq deb topdi.</w:t>
+      </w:r>
+    </w:p>
+    <w:p>
+      <w:pPr>
+        <w:spacing w:after="0" w:line="360" w:lineRule="auto"/>
+        <w:ind w:firstLine="567"/>
+        <w:jc w:val="both"/>
+        <w:rPr>
+          <w:rFonts w:ascii="Times New Roman" w:eastAsia="Times New Roman" w:hAnsi="Times New Roman" w:cs="Times New Roman"/>
+          <w:sz w:val="28"/>
+          <w:szCs w:val="28"/>
+          <w:lang w:val="en-US" w:eastAsia="ru-RU"/>
+        </w:rPr>
+      </w:pPr>
+      <w:r>
+        <w:rPr>
+          <w:rFonts w:ascii="Times New Roman" w:eastAsia="Times New Roman" w:hAnsi="Times New Roman" w:cs="Times New Roman"/>
+          <w:sz w:val="28"/>
+          <w:szCs w:val="28"/>
+          <w:lang w:val="en-US" w:eastAsia="ru-RU"/>
+        </w:rPr>
+        <w:t>Ushbu qarorlar ijrosini nazorat qilish fakultet dekani Djumayev F.T.ga yuklatilsin.</w:t>
+      </w:r>
+      <w:r>
+        <w:rPr>
+          <w:rFonts w:ascii="Times New Roman" w:eastAsia="Times New Roman" w:hAnsi="Times New Roman" w:cs="Times New Roman"/>
+          <w:b/>
+          <w:bCs/>
+          <w:sz w:val="28"/>
+          <w:szCs w:val="28"/>
+          <w:lang w:val="en-US" w:eastAsia="ru-RU"/>
+        </w:rPr>
+      </w:r>
+      <w:r>
+        <w:rPr>
+          <w:rFonts w:ascii="Times New Roman" w:eastAsia="Times New Roman" w:hAnsi="Times New Roman" w:cs="Times New Roman"/>
+          <w:sz w:val="28"/>
+          <w:szCs w:val="28"/>
+          <w:lang w:val="en-US" w:eastAsia="ru-RU"/>
+        </w:rPr>
+      </w:r>
+    </w:p>
+    <w:p>
+      <w:pPr>
+        <w:spacing w:after="0" w:line="360" w:lineRule="auto"/>
+        <w:ind w:firstLine="567"/>
+        <w:jc w:val="both"/>
+        <w:rPr>
+          <w:rFonts w:ascii="Times New Roman" w:eastAsia="Times New Roman" w:hAnsi="Times New Roman" w:cs="Times New Roman"/>
+          <w:sz w:val="28"/>
+          <w:szCs w:val="28"/>
+          <w:lang w:val="en-US" w:eastAsia="ru-RU"/>
+        </w:rPr>
+      </w:pPr>
+    </w:p>
+    <w:p>
+      <w:pPr>
+        <w:spacing w:after="0" w:line="360" w:lineRule="auto"/>
+        <w:ind w:firstLine="567"/>
+        <w:jc w:val="both"/>
+        <w:rPr>
+          <w:rFonts w:ascii="Times New Roman" w:eastAsia="Times New Roman" w:hAnsi="Times New Roman" w:cs="Times New Roman"/>
+          <w:sz w:val="28"/>
+          <w:szCs w:val="28"/>
+          <w:lang w:val="en-US" w:eastAsia="ru-RU"/>
+        </w:rPr>
+      </w:pPr>
+      <w:r>
+        <w:rPr>
+          <w:rFonts w:ascii="Times New Roman" w:eastAsia="Times New Roman" w:hAnsi="Times New Roman" w:cs="Times New Roman"/>
+          <w:b/>
+          <w:bCs/>
+          <w:sz w:val="28"/>
+          <w:szCs w:val="28"/>
+          <w:lang w:val="en-US" w:eastAsia="ru-RU"/>
+        </w:rPr>
+        <w:t>Fakultet kengashi raisi: _____________ F.T. Djumayev</w:t>
+      </w:r>
+      <w:r>
+        <w:rPr>
+          <w:rFonts w:ascii="Times New Roman" w:eastAsia="Times New Roman" w:hAnsi="Times New Roman" w:cs="Times New Roman"/>
+          <w:sz w:val="28"/>
+          <w:szCs w:val="28"/>
+          <w:lang w:val="en-US" w:eastAsia="ru-RU"/>
+        </w:rPr>
+      </w:r>
+    </w:p>
+    <w:p>
+      <w:pPr>
+        <w:spacing w:after="0" w:line="360" w:lineRule="auto"/>
+        <w:ind w:firstLine="567"/>
+        <w:jc w:val="both"/>
+        <w:rPr>
+          <w:rFonts w:ascii="Times New Roman" w:eastAsia="Times New Roman" w:hAnsi="Times New Roman" w:cs="Times New Roman"/>
+          <w:sz w:val="28"/>
+          <w:szCs w:val="28"/>
+          <w:lang w:val="en-US" w:eastAsia="ru-RU"/>
+        </w:rPr>
+      </w:pPr>
+      <w:r>
+        <w:rPr>
+          <w:rFonts w:ascii="Times New Roman" w:eastAsia="Times New Roman" w:hAnsi="Times New Roman" w:cs="Times New Roman"/>
+          <w:b/>
+          <w:bCs/>
+          <w:sz w:val="28"/>
+          <w:szCs w:val="28"/>
+          <w:lang w:val="en-US" w:eastAsia="ru-RU"/>
+        </w:rPr>
+        <w:t>Fakultet kengashi kotibi: _____________ B.P. Abdullayev</w:t>
+      </w:r>
+      <w:r>
+        <w:rPr>
+          <w:rFonts w:ascii="Times New Roman" w:eastAsia="Times New Roman" w:hAnsi="Times New Roman" w:cs="Times New Roman"/>
+          <w:sz w:val="28"/>
+          <w:szCs w:val="28"/>
+          <w:lang w:val="en-US" w:eastAsia="ru-RU"/>
+        </w:rPr>
       </w:r>
     </w:p>
     <w:p>
@@ -3035,33 +2968,7 @@
 </w:document>
 </file>
 
-<file path=word\fontTable.xml><?xml version="1.0" encoding="utf-8"?>
-<w:fonts xmlns:mc="http://schemas.openxmlformats.org/markup-compatibility/2006" xmlns:r="http://schemas.openxmlformats.org/officeDocument/2006/relationships" xmlns:w="http://schemas.openxmlformats.org/wordprocessingml/2006/main" xmlns:w14="http://schemas.microsoft.com/office/word/2010/wordml" xmlns:w15="http://schemas.microsoft.com/office/word/2012/wordml" xmlns:w16cex="http://schemas.microsoft.com/office/word/2018/wordml/cex" xmlns:w16cid="http://schemas.microsoft.com/office/word/2016/wordml/cid" xmlns:w16="http://schemas.microsoft.com/office/word/2018/wordml" xmlns:w16se="http://schemas.microsoft.com/office/word/2015/wordml/symex" mc:Ignorable="w14 w15 w16se w16cid w16 w16cex">
-  <w:font w:name="Calibri">
-    <w:panose1 w:val="020F0502020204030204"/>
-    <w:charset w:val="CC"/>
-    <w:family w:val="swiss"/>
-    <w:pitch w:val="variable"/>
-    <w:sig w:usb0="E4002EFF" w:usb1="C200247B" w:usb2="00000009" w:usb3="00000000" w:csb0="000001FF" w:csb1="00000000"/>
-  </w:font>
-  <w:font w:name="Times New Roman">
-    <w:panose1 w:val="02020603050405020304"/>
-    <w:charset w:val="00"/>
-    <w:family w:val="roman"/>
-    <w:pitch w:val="variable"/>
-    <w:sig w:usb0="E0002EFF" w:usb1="C000785B" w:usb2="00000009" w:usb3="00000000" w:csb0="000001FF" w:csb1="00000000"/>
-  </w:font>
-  <w:font w:name="Calibri Light">
-    <w:panose1 w:val="020F0302020204030204"/>
-    <w:charset w:val="CC"/>
-    <w:family w:val="swiss"/>
-    <w:pitch w:val="variable"/>
-    <w:sig w:usb0="E4002EFF" w:usb1="C200247B" w:usb2="00000009" w:usb3="00000000" w:csb0="000001FF" w:csb1="00000000"/>
-  </w:font>
-</w:fonts>
-</file>
-
-<file path=word\numbering.xml><?xml version="1.0" encoding="utf-8"?>
+<file path=word/numbering.xml><?xml version="1.0" encoding="utf-8"?>
 <w:numbering xmlns:wpc="http://schemas.microsoft.com/office/word/2010/wordprocessingCanvas" xmlns:cx="http://schemas.microsoft.com/office/drawing/2014/chartex" xmlns:cx1="http://schemas.microsoft.com/office/drawing/2015/9/8/chartex" xmlns:cx2="http://schemas.microsoft.com/office/drawing/2015/10/21/chartex" xmlns:cx3="http://schemas.microsoft.com/office/drawing/2016/5/9/chartex" xmlns:cx4="http://schemas.microsoft.com/office/drawing/2016/5/10/chartex" xmlns:cx5="http://schemas.microsoft.com/office/drawing/2016/5/11/chartex" xmlns:cx6="http://schemas.microsoft.com/office/drawing/2016/5/12/chartex" xmlns:cx7="http://schemas.microsoft.com/office/drawing/2016/5/13/chartex" xmlns:cx8="http://schemas.microsoft.com/office/drawing/2016/5/14/chartex" xmlns:mc="http://schemas.openxmlformats.org/markup-compatibility/2006" xmlns:aink="http://schemas.microsoft.com/office/drawing/2016/ink" xmlns:am3d="http://schemas.microsoft.com/office/drawing/2017/model3d" xmlns:o="urn:schemas-microsoft-com:office:office" xmlns:r="http://schemas.openxmlformats.org/officeDocument/2006/relationships" xmlns:m="http://schemas.openxmlformats.org/officeDocument/2006/math" xmlns:v="urn:schemas-microsoft-com:vml" xmlns:wp14="http://schemas.microsoft.com/office/word/2010/wordprocessingDrawing" xmlns:wp="http://schemas.openxmlformats.org/drawingml/2006/wordprocessingDrawing" xmlns:w10="urn:schemas-microsoft-com:office:word" xmlns:w="http://schemas.openxmlformats.org/wordprocessingml/2006/main" xmlns:w14="http://schemas.microsoft.com/office/word/2010/wordml" xmlns:w15="http://schemas.microsoft.com/office/word/2012/wordml" xmlns:w16cex="http://schemas.microsoft.com/office/word/2018/wordml/cex" xmlns:w16cid="http://schemas.microsoft.com/office/word/2016/wordml/cid" xmlns:w16="http://schemas.microsoft.com/office/word/2018/wordml" xmlns:w16se="http://schemas.microsoft.com/office/word/2015/wordml/symex" xmlns:wpg="http://schemas.microsoft.com/office/word/2010/wordprocessingGroup" xmlns:wpi="http://schemas.microsoft.com/office/word/2010/wordprocessingInk" xmlns:wne="http://schemas.microsoft.com/office/word/2006/wordml" xmlns:wps="http://schemas.microsoft.com/office/word/2010/wordprocessingShape" mc:Ignorable="w14 w15 w16se w16cid w16 w16cex wp14">
   <w:abstractNum w:abstractNumId="0" w15:restartNumberingAfterBreak="0">
     <w:nsid w:val="09C6249B"/>
@@ -4226,63 +4133,7 @@
 </w:numbering>
 </file>
 
-<file path=word\settings.xml><?xml version="1.0" encoding="utf-8"?>
-<w:settings xmlns:mc="http://schemas.openxmlformats.org/markup-compatibility/2006" xmlns:o="urn:schemas-microsoft-com:office:office" xmlns:r="http://schemas.openxmlformats.org/officeDocument/2006/relationships" xmlns:m="http://schemas.openxmlformats.org/officeDocument/2006/math" xmlns:v="urn:schemas-microsoft-com:vml" xmlns:w10="urn:schemas-microsoft-com:office:word" xmlns:w="http://schemas.openxmlformats.org/wordprocessingml/2006/main" xmlns:w14="http://schemas.microsoft.com/office/word/2010/wordml" xmlns:w15="http://schemas.microsoft.com/office/word/2012/wordml" xmlns:w16cex="http://schemas.microsoft.com/office/word/2018/wordml/cex" xmlns:w16cid="http://schemas.microsoft.com/office/word/2016/wordml/cid" xmlns:w16="http://schemas.microsoft.com/office/word/2018/wordml" xmlns:w16se="http://schemas.microsoft.com/office/word/2015/wordml/symex" xmlns:sl="http://schemas.openxmlformats.org/schemaLibrary/2006/main" mc:Ignorable="w14 w15 w16se w16cid w16 w16cex">
-  <w:zoom w:percent="100"/>
-  <w:proofState w:spelling="clean" w:grammar="clean"/>
-  <w:defaultTabStop w:val="708"/>
-  <w:drawingGridHorizontalSpacing w:val="110"/>
-  <w:drawingGridVerticalSpacing w:val="299"/>
-  <w:displayHorizontalDrawingGridEvery w:val="0"/>
-  <w:characterSpacingControl w:val="doNotCompress"/>
-  <w:compat>
-    <w:compatSetting w:name="compatibilityMode" w:uri="http://schemas.microsoft.com/office/word" w:val="15"/>
-    <w:compatSetting w:name="overrideTableStyleFontSizeAndJustification" w:uri="http://schemas.microsoft.com/office/word" w:val="1"/>
-    <w:compatSetting w:name="enableOpenTypeFeatures" w:uri="http://schemas.microsoft.com/office/word" w:val="1"/>
-    <w:compatSetting w:name="doNotFlipMirrorIndents" w:uri="http://schemas.microsoft.com/office/word" w:val="1"/>
-    <w:compatSetting w:name="differentiateMultirowTableHeaders" w:uri="http://schemas.microsoft.com/office/word" w:val="1"/>
-    <w:compatSetting w:name="useWord2013TrackBottomHyphenation" w:uri="http://schemas.microsoft.com/office/word" w:val="0"/>
-  </w:compat>
-  <w:rsids>
-    <w:rsidRoot w:val="00DB024D"/>
-    <w:rsid w:val="00277F1A"/>
-    <w:rsid w:val="00345CB4"/>
-    <w:rsid w:val="00367C87"/>
-    <w:rsid w:val="0039120F"/>
-    <w:rsid w:val="00455FB0"/>
-    <w:rsid w:val="00745138"/>
-    <w:rsid w:val="00DB024D"/>
-  </w:rsids>
-  <m:mathPr>
-    <m:mathFont m:val="Cambria Math"/>
-    <m:brkBin m:val="before"/>
-    <m:brkBinSub m:val="--"/>
-    <m:smallFrac m:val="0"/>
-    <m:dispDef/>
-    <m:lMargin m:val="0"/>
-    <m:rMargin m:val="0"/>
-    <m:defJc m:val="centerGroup"/>
-    <m:wrapIndent m:val="1440"/>
-    <m:intLim m:val="subSup"/>
-    <m:naryLim m:val="undOvr"/>
-  </m:mathPr>
-  <w:themeFontLang w:val="ru-RU"/>
-  <w:clrSchemeMapping w:bg1="light1" w:t1="dark1" w:bg2="light2" w:t2="dark2" w:accent1="accent1" w:accent2="accent2" w:accent3="accent3" w:accent4="accent4" w:accent5="accent5" w:accent6="accent6" w:hyperlink="hyperlink" w:followedHyperlink="followedHyperlink"/>
-  <w:shapeDefaults>
-    <o:shapedefaults v:ext="edit" spidmax="1026"/>
-    <o:shapelayout v:ext="edit">
-      <o:idmap v:ext="edit" data="1"/>
-    </o:shapelayout>
-  </w:shapeDefaults>
-  <w:decimalSymbol w:val=","/>
-  <w:listSeparator w:val=";"/>
-  <w14:docId w14:val="0B1B46FD"/>
-  <w15:chartTrackingRefBased/>
-  <w15:docId w15:val="{13673247-88E5-44ED-BD3E-92DC7BCB9E04}"/>
-</w:settings>
-</file>
-
-<file path=word\styles.xml><?xml version="1.0" encoding="utf-8"?>
+<file path=word/styles.xml><?xml version="1.0" encoding="utf-8"?>
 <w:styles xmlns:mc="http://schemas.openxmlformats.org/markup-compatibility/2006" xmlns:r="http://schemas.openxmlformats.org/officeDocument/2006/relationships" xmlns:w="http://schemas.openxmlformats.org/wordprocessingml/2006/main" xmlns:w14="http://schemas.microsoft.com/office/word/2010/wordml" xmlns:w15="http://schemas.microsoft.com/office/word/2012/wordml" xmlns:w16cex="http://schemas.microsoft.com/office/word/2018/wordml/cex" xmlns:w16cid="http://schemas.microsoft.com/office/word/2016/wordml/cid" xmlns:w16="http://schemas.microsoft.com/office/word/2018/wordml" xmlns:w16se="http://schemas.microsoft.com/office/word/2015/wordml/symex" mc:Ignorable="w14 w15 w16se w16cid w16 w16cex">
   <w:docDefaults>
     <w:rPrDefault>
@@ -4855,7 +4706,7 @@
 </w:styles>
 </file>
 
-<file path=word\theme\theme1.xml><?xml version="1.0" encoding="utf-8"?>
+<file path=word/theme/theme1.xml><?xml version="1.0" encoding="utf-8"?>
 <a:theme xmlns:a="http://schemas.openxmlformats.org/drawingml/2006/main" name="Тема Office">
   <a:themeElements>
     <a:clrScheme name="Стандартная">
@@ -5148,249 +4999,4 @@
     </a:ext>
   </a:extLst>
 </a:theme>
-</file>
-
-<file path=word\webSettings.xml><?xml version="1.0" encoding="utf-8"?>
-<w:webSettings xmlns:mc="http://schemas.openxmlformats.org/markup-compatibility/2006" xmlns:r="http://schemas.openxmlformats.org/officeDocument/2006/relationships" xmlns:w="http://schemas.openxmlformats.org/wordprocessingml/2006/main" xmlns:w14="http://schemas.microsoft.com/office/word/2010/wordml" xmlns:w15="http://schemas.microsoft.com/office/word/2012/wordml" xmlns:w16cex="http://schemas.microsoft.com/office/word/2018/wordml/cex" xmlns:w16cid="http://schemas.microsoft.com/office/word/2016/wordml/cid" xmlns:w16="http://schemas.microsoft.com/office/word/2018/wordml" xmlns:w16se="http://schemas.microsoft.com/office/word/2015/wordml/symex" mc:Ignorable="w14 w15 w16se w16cid w16 w16cex">
-  <w:divs>
-    <w:div w:id="419641455">
-      <w:bodyDiv w:val="1"/>
-      <w:marLeft w:val="0"/>
-      <w:marRight w:val="0"/>
-      <w:marTop w:val="0"/>
-      <w:marBottom w:val="0"/>
-      <w:divBdr>
-        <w:top w:val="none" w:sz="0" w:space="0" w:color="auto"/>
-        <w:left w:val="none" w:sz="0" w:space="0" w:color="auto"/>
-        <w:bottom w:val="none" w:sz="0" w:space="0" w:color="auto"/>
-        <w:right w:val="none" w:sz="0" w:space="0" w:color="auto"/>
-      </w:divBdr>
-    </w:div>
-    <w:div w:id="1075737206">
-      <w:bodyDiv w:val="1"/>
-      <w:marLeft w:val="0"/>
-      <w:marRight w:val="0"/>
-      <w:marTop w:val="0"/>
-      <w:marBottom w:val="0"/>
-      <w:divBdr>
-        <w:top w:val="none" w:sz="0" w:space="0" w:color="auto"/>
-        <w:left w:val="none" w:sz="0" w:space="0" w:color="auto"/>
-        <w:bottom w:val="none" w:sz="0" w:space="0" w:color="auto"/>
-        <w:right w:val="none" w:sz="0" w:space="0" w:color="auto"/>
-      </w:divBdr>
-      <w:divsChild>
-        <w:div w:id="511455412">
-          <w:blockQuote w:val="1"/>
-          <w:marLeft w:val="720"/>
-          <w:marRight w:val="720"/>
-          <w:marTop w:val="100"/>
-          <w:marBottom w:val="100"/>
-          <w:divBdr>
-            <w:top w:val="none" w:sz="0" w:space="0" w:color="auto"/>
-            <w:left w:val="none" w:sz="0" w:space="0" w:color="auto"/>
-            <w:bottom w:val="none" w:sz="0" w:space="0" w:color="auto"/>
-            <w:right w:val="none" w:sz="0" w:space="0" w:color="auto"/>
-          </w:divBdr>
-        </w:div>
-        <w:div w:id="1835026969">
-          <w:blockQuote w:val="1"/>
-          <w:marLeft w:val="720"/>
-          <w:marRight w:val="720"/>
-          <w:marTop w:val="100"/>
-          <w:marBottom w:val="100"/>
-          <w:divBdr>
-            <w:top w:val="none" w:sz="0" w:space="0" w:color="auto"/>
-            <w:left w:val="none" w:sz="0" w:space="0" w:color="auto"/>
-            <w:bottom w:val="none" w:sz="0" w:space="0" w:color="auto"/>
-            <w:right w:val="none" w:sz="0" w:space="0" w:color="auto"/>
-          </w:divBdr>
-        </w:div>
-        <w:div w:id="723604408">
-          <w:blockQuote w:val="1"/>
-          <w:marLeft w:val="720"/>
-          <w:marRight w:val="720"/>
-          <w:marTop w:val="100"/>
-          <w:marBottom w:val="100"/>
-          <w:divBdr>
-            <w:top w:val="none" w:sz="0" w:space="0" w:color="auto"/>
-            <w:left w:val="none" w:sz="0" w:space="0" w:color="auto"/>
-            <w:bottom w:val="none" w:sz="0" w:space="0" w:color="auto"/>
-            <w:right w:val="none" w:sz="0" w:space="0" w:color="auto"/>
-          </w:divBdr>
-        </w:div>
-        <w:div w:id="1335186605">
-          <w:blockQuote w:val="1"/>
-          <w:marLeft w:val="720"/>
-          <w:marRight w:val="720"/>
-          <w:marTop w:val="100"/>
-          <w:marBottom w:val="100"/>
-          <w:divBdr>
-            <w:top w:val="none" w:sz="0" w:space="0" w:color="auto"/>
-            <w:left w:val="none" w:sz="0" w:space="0" w:color="auto"/>
-            <w:bottom w:val="none" w:sz="0" w:space="0" w:color="auto"/>
-            <w:right w:val="none" w:sz="0" w:space="0" w:color="auto"/>
-          </w:divBdr>
-        </w:div>
-        <w:div w:id="1777016374">
-          <w:blockQuote w:val="1"/>
-          <w:marLeft w:val="720"/>
-          <w:marRight w:val="720"/>
-          <w:marTop w:val="100"/>
-          <w:marBottom w:val="100"/>
-          <w:divBdr>
-            <w:top w:val="none" w:sz="0" w:space="0" w:color="auto"/>
-            <w:left w:val="none" w:sz="0" w:space="0" w:color="auto"/>
-            <w:bottom w:val="none" w:sz="0" w:space="0" w:color="auto"/>
-            <w:right w:val="none" w:sz="0" w:space="0" w:color="auto"/>
-          </w:divBdr>
-        </w:div>
-        <w:div w:id="344016566">
-          <w:blockQuote w:val="1"/>
-          <w:marLeft w:val="720"/>
-          <w:marRight w:val="720"/>
-          <w:marTop w:val="100"/>
-          <w:marBottom w:val="100"/>
-          <w:divBdr>
-            <w:top w:val="none" w:sz="0" w:space="0" w:color="auto"/>
-            <w:left w:val="none" w:sz="0" w:space="0" w:color="auto"/>
-            <w:bottom w:val="none" w:sz="0" w:space="0" w:color="auto"/>
-            <w:right w:val="none" w:sz="0" w:space="0" w:color="auto"/>
-          </w:divBdr>
-        </w:div>
-        <w:div w:id="1492722697">
-          <w:blockQuote w:val="1"/>
-          <w:marLeft w:val="720"/>
-          <w:marRight w:val="720"/>
-          <w:marTop w:val="100"/>
-          <w:marBottom w:val="100"/>
-          <w:divBdr>
-            <w:top w:val="none" w:sz="0" w:space="0" w:color="auto"/>
-            <w:left w:val="none" w:sz="0" w:space="0" w:color="auto"/>
-            <w:bottom w:val="none" w:sz="0" w:space="0" w:color="auto"/>
-            <w:right w:val="none" w:sz="0" w:space="0" w:color="auto"/>
-          </w:divBdr>
-        </w:div>
-        <w:div w:id="195238485">
-          <w:blockQuote w:val="1"/>
-          <w:marLeft w:val="720"/>
-          <w:marRight w:val="720"/>
-          <w:marTop w:val="100"/>
-          <w:marBottom w:val="100"/>
-          <w:divBdr>
-            <w:top w:val="none" w:sz="0" w:space="0" w:color="auto"/>
-            <w:left w:val="none" w:sz="0" w:space="0" w:color="auto"/>
-            <w:bottom w:val="none" w:sz="0" w:space="0" w:color="auto"/>
-            <w:right w:val="none" w:sz="0" w:space="0" w:color="auto"/>
-          </w:divBdr>
-        </w:div>
-        <w:div w:id="1494565841">
-          <w:blockQuote w:val="1"/>
-          <w:marLeft w:val="720"/>
-          <w:marRight w:val="720"/>
-          <w:marTop w:val="100"/>
-          <w:marBottom w:val="100"/>
-          <w:divBdr>
-            <w:top w:val="none" w:sz="0" w:space="0" w:color="auto"/>
-            <w:left w:val="none" w:sz="0" w:space="0" w:color="auto"/>
-            <w:bottom w:val="none" w:sz="0" w:space="0" w:color="auto"/>
-            <w:right w:val="none" w:sz="0" w:space="0" w:color="auto"/>
-          </w:divBdr>
-        </w:div>
-        <w:div w:id="1458790705">
-          <w:blockQuote w:val="1"/>
-          <w:marLeft w:val="720"/>
-          <w:marRight w:val="720"/>
-          <w:marTop w:val="100"/>
-          <w:marBottom w:val="100"/>
-          <w:divBdr>
-            <w:top w:val="none" w:sz="0" w:space="0" w:color="auto"/>
-            <w:left w:val="none" w:sz="0" w:space="0" w:color="auto"/>
-            <w:bottom w:val="none" w:sz="0" w:space="0" w:color="auto"/>
-            <w:right w:val="none" w:sz="0" w:space="0" w:color="auto"/>
-          </w:divBdr>
-        </w:div>
-        <w:div w:id="1114906407">
-          <w:blockQuote w:val="1"/>
-          <w:marLeft w:val="720"/>
-          <w:marRight w:val="720"/>
-          <w:marTop w:val="100"/>
-          <w:marBottom w:val="100"/>
-          <w:divBdr>
-            <w:top w:val="none" w:sz="0" w:space="0" w:color="auto"/>
-            <w:left w:val="none" w:sz="0" w:space="0" w:color="auto"/>
-            <w:bottom w:val="none" w:sz="0" w:space="0" w:color="auto"/>
-            <w:right w:val="none" w:sz="0" w:space="0" w:color="auto"/>
-          </w:divBdr>
-        </w:div>
-        <w:div w:id="714087115">
-          <w:blockQuote w:val="1"/>
-          <w:marLeft w:val="720"/>
-          <w:marRight w:val="720"/>
-          <w:marTop w:val="100"/>
-          <w:marBottom w:val="100"/>
-          <w:divBdr>
-            <w:top w:val="none" w:sz="0" w:space="0" w:color="auto"/>
-            <w:left w:val="none" w:sz="0" w:space="0" w:color="auto"/>
-            <w:bottom w:val="none" w:sz="0" w:space="0" w:color="auto"/>
-            <w:right w:val="none" w:sz="0" w:space="0" w:color="auto"/>
-          </w:divBdr>
-        </w:div>
-        <w:div w:id="1639144156">
-          <w:blockQuote w:val="1"/>
-          <w:marLeft w:val="720"/>
-          <w:marRight w:val="720"/>
-          <w:marTop w:val="100"/>
-          <w:marBottom w:val="100"/>
-          <w:divBdr>
-            <w:top w:val="none" w:sz="0" w:space="0" w:color="auto"/>
-            <w:left w:val="none" w:sz="0" w:space="0" w:color="auto"/>
-            <w:bottom w:val="none" w:sz="0" w:space="0" w:color="auto"/>
-            <w:right w:val="none" w:sz="0" w:space="0" w:color="auto"/>
-          </w:divBdr>
-        </w:div>
-        <w:div w:id="826361064">
-          <w:blockQuote w:val="1"/>
-          <w:marLeft w:val="720"/>
-          <w:marRight w:val="720"/>
-          <w:marTop w:val="100"/>
-          <w:marBottom w:val="100"/>
-          <w:divBdr>
-            <w:top w:val="none" w:sz="0" w:space="0" w:color="auto"/>
-            <w:left w:val="none" w:sz="0" w:space="0" w:color="auto"/>
-            <w:bottom w:val="none" w:sz="0" w:space="0" w:color="auto"/>
-            <w:right w:val="none" w:sz="0" w:space="0" w:color="auto"/>
-          </w:divBdr>
-        </w:div>
-        <w:div w:id="634602012">
-          <w:blockQuote w:val="1"/>
-          <w:marLeft w:val="720"/>
-          <w:marRight w:val="720"/>
-          <w:marTop w:val="100"/>
-          <w:marBottom w:val="100"/>
-          <w:divBdr>
-            <w:top w:val="none" w:sz="0" w:space="0" w:color="auto"/>
-            <w:left w:val="none" w:sz="0" w:space="0" w:color="auto"/>
-            <w:bottom w:val="none" w:sz="0" w:space="0" w:color="auto"/>
-            <w:right w:val="none" w:sz="0" w:space="0" w:color="auto"/>
-          </w:divBdr>
-        </w:div>
-        <w:div w:id="1322273763">
-          <w:blockQuote w:val="1"/>
-          <w:marLeft w:val="720"/>
-          <w:marRight w:val="720"/>
-          <w:marTop w:val="100"/>
-          <w:marBottom w:val="100"/>
-          <w:divBdr>
-            <w:top w:val="none" w:sz="0" w:space="0" w:color="auto"/>
-            <w:left w:val="none" w:sz="0" w:space="0" w:color="auto"/>
-            <w:bottom w:val="none" w:sz="0" w:space="0" w:color="auto"/>
-            <w:right w:val="none" w:sz="0" w:space="0" w:color="auto"/>
-          </w:divBdr>
-        </w:div>
-      </w:divsChild>
-    </w:div>
-  </w:divs>
-  <w:optimizeForBrowser/>
-  <w:allowPNG/>
-</w:webSettings>
 </file>
</xml_diff>